<commit_message>
Update CV to compact 2-page executive format
Redesigned with tighter spacing, condensed sections, two-column
layouts for certifications and skills, and tabular prior experience.
Fits cleanly within 2 pages.

Co-Authored-By: Claude Opus 4.6 <noreply@anthropic.com>
Claude-Session: https://claude.ai/code/session_01AGBHTG8w5UznQHWCJRee6R
</commit_message>
<xml_diff>
--- a/HOJA_DE_VIDA_Carlos_Cordero_2026.docx
+++ b/HOJA_DE_VIDA_Carlos_Cordero_2026.docx
@@ -5,7 +5,6 @@
     <w:tbl>
       <w:tblPr>
         <w:tblW w:type="auto" w:w="0"/>
-        <w:jc w:val="center"/>
         <w:tblLook w:firstColumn="1" w:firstRow="1" w:lastColumn="0" w:lastRow="0" w:noHBand="0" w:noVBand="1" w:val="04A0"/>
         <w:tblW w:type="pct" w:w="5000"/>
         <w:tblBorders>
@@ -18,31 +17,31 @@
         </w:tblBorders>
       </w:tblPr>
       <w:tblGrid>
-        <w:gridCol w:w="9972"/>
+        <w:gridCol w:w="10200"/>
       </w:tblGrid>
       <w:tr>
         <w:tc>
           <w:tcPr>
-            <w:tcW w:type="dxa" w:w="9972"/>
+            <w:tcW w:type="dxa" w:w="10200"/>
             <w:shd w:fill="1B3A5C" w:val="clear"/>
             <w:tcMar>
-              <w:top w:w="200" w:type="dxa"/>
-              <w:left w:w="300" w:type="dxa"/>
-              <w:bottom w:w="200" w:type="dxa"/>
-              <w:right w:w="300" w:type="dxa"/>
+              <w:top w:w="140" w:type="dxa"/>
+              <w:left w:w="200" w:type="dxa"/>
+              <w:bottom w:w="100" w:type="dxa"/>
+              <w:right w:w="200" w:type="dxa"/>
             </w:tcMar>
           </w:tcPr>
           <w:p>
             <w:pPr>
-              <w:spacing w:before="80" w:after="40"/>
               <w:jc w:val="center"/>
             </w:pPr>
             <w:r>
               <w:rPr>
                 <w:rFonts w:ascii="Calibri" w:hAnsi="Calibri"/>
                 <w:b/>
+                <w:i w:val="0"/>
                 <w:color w:val="FFFFFF"/>
-                <w:sz w:val="44"/>
+                <w:sz w:val="40"/>
                 <w:spacing w:val="80"/>
               </w:rPr>
               <w:t>CARLOS XAVIER CORDERO OSINAGA</w:t>
@@ -50,31 +49,19 @@
           </w:p>
           <w:p>
             <w:pPr>
-              <w:spacing w:before="0" w:after="40"/>
+              <w:spacing w:before="40"/>
               <w:jc w:val="center"/>
             </w:pPr>
             <w:r>
               <w:rPr>
                 <w:rFonts w:ascii="Calibri" w:hAnsi="Calibri"/>
+                <w:b w:val="0"/>
+                <w:i w:val="0"/>
                 <w:color w:val="A8D0E6"/>
-                <w:sz w:val="26"/>
-                <w:spacing w:val="120"/>
+                <w:sz w:val="22"/>
+                <w:spacing w:val="100"/>
               </w:rPr>
               <w:t>INGENIERO AMBIENTAL</w:t>
-            </w:r>
-          </w:p>
-          <w:p>
-            <w:pPr>
-              <w:spacing w:before="40" w:after="80"/>
-              <w:jc w:val="center"/>
-            </w:pPr>
-            <w:r>
-              <w:rPr>
-                <w:rFonts w:ascii="Calibri" w:hAnsi="Calibri"/>
-                <w:color w:val="CCDDEE"/>
-                <w:sz w:val="19"/>
-              </w:rPr>
-              <w:t>Gestión Ambiental  •  Fiscalización  •  Control de Riesgos  •  Seguridad Industrial</w:t>
             </w:r>
           </w:p>
         </w:tc>
@@ -83,2050 +70,6 @@
     <w:tbl>
       <w:tblPr>
         <w:tblW w:type="auto" w:w="0"/>
-        <w:jc w:val="center"/>
-        <w:tblLook w:firstColumn="1" w:firstRow="1" w:lastColumn="0" w:lastRow="0" w:noHBand="0" w:noVBand="1" w:val="04A0"/>
-        <w:tblW w:type="pct" w:w="5000"/>
-        <w:tblBorders>
-          <w:top w:val="none" w:sz="0" w:space="0" w:color="auto"/>
-          <w:left w:val="none" w:sz="0" w:space="0" w:color="auto"/>
-          <w:bottom w:val="single" w:sz="8" w:space="0" w:color="1B3A5C"/>
-          <w:right w:val="none" w:sz="0" w:space="0" w:color="auto"/>
-          <w:insideH w:val="none" w:sz="0" w:space="0" w:color="auto"/>
-          <w:insideV w:val="none" w:sz="0" w:space="0" w:color="auto"/>
-        </w:tblBorders>
-      </w:tblPr>
-      <w:tblGrid>
-        <w:gridCol w:w="2493"/>
-        <w:gridCol w:w="2493"/>
-        <w:gridCol w:w="2493"/>
-        <w:gridCol w:w="2493"/>
-      </w:tblGrid>
-      <w:tr>
-        <w:tc>
-          <w:tcPr>
-            <w:tcW w:type="dxa" w:w="2493"/>
-          </w:tcPr>
-          <w:p>
-            <w:pPr>
-              <w:spacing w:before="120" w:after="120"/>
-              <w:jc w:val="center"/>
-            </w:pPr>
-            <w:r>
-              <w:rPr>
-                <w:rFonts w:ascii="Calibri" w:hAnsi="Calibri"/>
-                <w:color w:val="2E86AB"/>
-                <w:sz w:val="18"/>
-              </w:rPr>
-              <w:t xml:space="preserve">☎  </w:t>
-            </w:r>
-            <w:r>
-              <w:rPr>
-                <w:rFonts w:ascii="Calibri" w:hAnsi="Calibri"/>
-                <w:color w:val="333333"/>
-                <w:sz w:val="18"/>
-              </w:rPr>
-              <w:t>708-79425 / 687-51323</w:t>
-            </w:r>
-          </w:p>
-        </w:tc>
-        <w:tc>
-          <w:tcPr>
-            <w:tcW w:type="dxa" w:w="2493"/>
-          </w:tcPr>
-          <w:p>
-            <w:pPr>
-              <w:spacing w:before="120" w:after="120"/>
-              <w:jc w:val="center"/>
-            </w:pPr>
-            <w:r>
-              <w:rPr>
-                <w:rFonts w:ascii="Calibri" w:hAnsi="Calibri"/>
-                <w:color w:val="2E86AB"/>
-                <w:sz w:val="18"/>
-              </w:rPr>
-              <w:t xml:space="preserve">✉  </w:t>
-            </w:r>
-            <w:r>
-              <w:rPr>
-                <w:rFonts w:ascii="Calibri" w:hAnsi="Calibri"/>
-                <w:color w:val="333333"/>
-                <w:sz w:val="18"/>
-              </w:rPr>
-              <w:t>carlos.xco@gmail.com</w:t>
-            </w:r>
-          </w:p>
-        </w:tc>
-        <w:tc>
-          <w:tcPr>
-            <w:tcW w:type="dxa" w:w="2493"/>
-          </w:tcPr>
-          <w:p>
-            <w:pPr>
-              <w:spacing w:before="120" w:after="120"/>
-              <w:jc w:val="center"/>
-            </w:pPr>
-            <w:r>
-              <w:rPr>
-                <w:rFonts w:ascii="Calibri" w:hAnsi="Calibri"/>
-                <w:color w:val="2E86AB"/>
-                <w:sz w:val="18"/>
-              </w:rPr>
-              <w:t xml:space="preserve">⌂  </w:t>
-            </w:r>
-            <w:r>
-              <w:rPr>
-                <w:rFonts w:ascii="Calibri" w:hAnsi="Calibri"/>
-                <w:color w:val="333333"/>
-                <w:sz w:val="18"/>
-              </w:rPr>
-              <w:t>Santa Cruz, Bolivia</w:t>
-            </w:r>
-          </w:p>
-        </w:tc>
-        <w:tc>
-          <w:tcPr>
-            <w:tcW w:type="dxa" w:w="2493"/>
-          </w:tcPr>
-          <w:p>
-            <w:pPr>
-              <w:spacing w:before="120" w:after="120"/>
-              <w:jc w:val="center"/>
-            </w:pPr>
-            <w:r>
-              <w:rPr>
-                <w:rFonts w:ascii="Calibri" w:hAnsi="Calibri"/>
-                <w:color w:val="2E86AB"/>
-                <w:sz w:val="18"/>
-              </w:rPr>
-              <w:t xml:space="preserve">⌖  </w:t>
-            </w:r>
-            <w:r>
-              <w:rPr>
-                <w:rFonts w:ascii="Calibri" w:hAnsi="Calibri"/>
-                <w:color w:val="333333"/>
-                <w:sz w:val="18"/>
-              </w:rPr>
-              <w:t>CI: 6254418 SC</w:t>
-            </w:r>
-          </w:p>
-        </w:tc>
-      </w:tr>
-    </w:tbl>
-    <w:p>
-      <w:pPr>
-        <w:spacing w:before="280" w:after="40"/>
-      </w:pPr>
-      <w:r>
-        <w:rPr>
-          <w:rFonts w:ascii="Calibri" w:hAnsi="Calibri"/>
-          <w:b/>
-          <w:color w:val="1B3A5C"/>
-          <w:sz w:val="24"/>
-          <w:spacing w:val="40"/>
-        </w:rPr>
-        <w:t>PERFIL PROFESIONAL</w:t>
-      </w:r>
-    </w:p>
-    <w:p>
-      <w:pPr>
-        <w:spacing w:before="40" w:after="120"/>
-        <w:pBdr>
-          <w:bottom w:val="single" w:sz="4" w:space="1" w:color="1B3A5C"/>
-        </w:pBdr>
-      </w:pPr>
-    </w:p>
-    <w:p>
-      <w:pPr>
-        <w:spacing w:before="80" w:after="80"/>
-        <w:jc w:val="both"/>
-      </w:pPr>
-      <w:r>
-        <w:rPr>
-          <w:rFonts w:ascii="Calibri" w:hAnsi="Calibri"/>
-          <w:color w:val="333333"/>
-          <w:sz w:val="20"/>
-        </w:rPr>
-        <w:t>Ingeniero Ambiental titulado de la Universidad Autónoma Gabriel René Moreno con más de 12 años de experiencia profesional en el sector público y privado. Trayectoria ascendente en entidades reguladoras del Estado, alcanzando posiciones de dirección y jefatura de unidad. Especializado en fiscalización, inspección técnica, control de riesgos, supervisión operativa y gestión de seguridad industrial (QHSE). Formación complementaria en sistemas de gestión OHSAS 18001, diseño de plantas de tratamiento de residuos, y teledetección aplicada. Capacidad demostrada para liderar equipos multidisciplinarios y gestionar procesos de cumplimiento normativo.</w:t>
-      </w:r>
-    </w:p>
-    <w:p>
-      <w:pPr>
-        <w:spacing w:before="280" w:after="40"/>
-      </w:pPr>
-      <w:r>
-        <w:rPr>
-          <w:rFonts w:ascii="Calibri" w:hAnsi="Calibri"/>
-          <w:b/>
-          <w:color w:val="1B3A5C"/>
-          <w:sz w:val="24"/>
-          <w:spacing w:val="40"/>
-        </w:rPr>
-        <w:t>EXPERIENCIA PROFESIONAL</w:t>
-      </w:r>
-    </w:p>
-    <w:p>
-      <w:pPr>
-        <w:spacing w:before="40" w:after="120"/>
-        <w:pBdr>
-          <w:bottom w:val="single" w:sz="4" w:space="1" w:color="1B3A5C"/>
-        </w:pBdr>
-      </w:pPr>
-    </w:p>
-    <w:p>
-      <w:pPr>
-        <w:spacing w:before="120" w:after="0"/>
-      </w:pPr>
-      <w:r>
-        <w:rPr>
-          <w:rFonts w:ascii="Calibri" w:hAnsi="Calibri"/>
-          <w:b/>
-          <w:color w:val="1B3A5C"/>
-          <w:sz w:val="23"/>
-        </w:rPr>
-        <w:t>ENTIDAD REGULADORA DEL SECTOR ENERGÉTICO</w:t>
-      </w:r>
-      <w:r>
-        <w:rPr>
-          <w:rFonts w:ascii="Calibri" w:hAnsi="Calibri"/>
-          <w:color w:val="666666"/>
-          <w:sz w:val="20"/>
-        </w:rPr>
-        <w:t xml:space="preserve">  •  Santa Cruz, Bolivia  •  2014 – Presente</w:t>
-      </w:r>
-    </w:p>
-    <w:p>
-      <w:pPr>
-        <w:spacing w:before="20" w:after="40"/>
-      </w:pPr>
-      <w:r>
-        <w:rPr>
-          <w:rFonts w:ascii="Calibri" w:hAnsi="Calibri"/>
-          <w:i/>
-          <w:color w:val="666666"/>
-          <w:sz w:val="19"/>
-        </w:rPr>
-        <w:t>Carrera institucional con ascenso progresivo desde nivel técnico hasta nivel directivo</w:t>
-      </w:r>
-    </w:p>
-    <w:p>
-      <w:pPr>
-        <w:spacing w:before="120" w:after="40"/>
-        <w:ind w:left="288"/>
-      </w:pPr>
-      <w:r>
-        <w:rPr>
-          <w:color w:val="2E86AB"/>
-          <w:sz w:val="18"/>
-        </w:rPr>
-        <w:t xml:space="preserve">▸ </w:t>
-      </w:r>
-      <w:r>
-        <w:rPr>
-          <w:rFonts w:ascii="Calibri" w:hAnsi="Calibri"/>
-          <w:b/>
-          <w:color w:val="0F2B46"/>
-          <w:sz w:val="20"/>
-        </w:rPr>
-        <w:t>Técnico en Operaciones – Dirección Distrital Santa Cruz</w:t>
-      </w:r>
-      <w:r>
-        <w:rPr>
-          <w:rFonts w:ascii="Calibri" w:hAnsi="Calibri"/>
-          <w:color w:val="666666"/>
-          <w:sz w:val="19"/>
-        </w:rPr>
-        <w:t xml:space="preserve">  (Mayo 2025 – Presente)</w:t>
-      </w:r>
-    </w:p>
-    <w:p>
-      <w:pPr>
-        <w:spacing w:before="20" w:after="20"/>
-        <w:ind w:left="720" w:hanging="288"/>
-      </w:pPr>
-      <w:r>
-        <w:rPr>
-          <w:rFonts w:ascii="Calibri" w:hAnsi="Calibri"/>
-          <w:color w:val="2E86AB"/>
-          <w:sz w:val="14"/>
-        </w:rPr>
-        <w:t xml:space="preserve">▪  </w:t>
-      </w:r>
-      <w:r>
-        <w:rPr>
-          <w:rFonts w:ascii="Calibri" w:hAnsi="Calibri"/>
-          <w:color w:val="333333"/>
-          <w:sz w:val="20"/>
-        </w:rPr>
-        <w:t>Ejecución y supervisión de operaciones técnicas en el distrito de Santa Cruz.</w:t>
-      </w:r>
-    </w:p>
-    <w:p>
-      <w:pPr>
-        <w:spacing w:before="20" w:after="20"/>
-        <w:ind w:left="720" w:hanging="288"/>
-      </w:pPr>
-      <w:r>
-        <w:rPr>
-          <w:rFonts w:ascii="Calibri" w:hAnsi="Calibri"/>
-          <w:color w:val="2E86AB"/>
-          <w:sz w:val="14"/>
-        </w:rPr>
-        <w:t xml:space="preserve">▪  </w:t>
-      </w:r>
-      <w:r>
-        <w:rPr>
-          <w:rFonts w:ascii="Calibri" w:hAnsi="Calibri"/>
-          <w:color w:val="333333"/>
-          <w:sz w:val="20"/>
-        </w:rPr>
-        <w:t>Elaboración de informes técnicos y documentación de procesos operativos.</w:t>
-      </w:r>
-    </w:p>
-    <w:p>
-      <w:pPr>
-        <w:spacing w:before="20" w:after="20"/>
-        <w:ind w:left="720" w:hanging="288"/>
-      </w:pPr>
-      <w:r>
-        <w:rPr>
-          <w:rFonts w:ascii="Calibri" w:hAnsi="Calibri"/>
-          <w:color w:val="2E86AB"/>
-          <w:sz w:val="14"/>
-        </w:rPr>
-        <w:t xml:space="preserve">▪  </w:t>
-      </w:r>
-      <w:r>
-        <w:rPr>
-          <w:rFonts w:ascii="Calibri" w:hAnsi="Calibri"/>
-          <w:color w:val="333333"/>
-          <w:sz w:val="20"/>
-        </w:rPr>
-        <w:t>Coordinación con áreas técnicas para el cumplimiento de la normativa vigente.</w:t>
-      </w:r>
-    </w:p>
-    <w:p>
-      <w:pPr>
-        <w:spacing w:before="120" w:after="40"/>
-        <w:ind w:left="288"/>
-      </w:pPr>
-      <w:r>
-        <w:rPr>
-          <w:color w:val="2E86AB"/>
-          <w:sz w:val="18"/>
-        </w:rPr>
-        <w:t xml:space="preserve">▸ </w:t>
-      </w:r>
-      <w:r>
-        <w:rPr>
-          <w:rFonts w:ascii="Calibri" w:hAnsi="Calibri"/>
-          <w:b/>
-          <w:color w:val="0F2B46"/>
-          <w:sz w:val="20"/>
-        </w:rPr>
-        <w:t>Director de Distritos Técnica</w:t>
-      </w:r>
-      <w:r>
-        <w:rPr>
-          <w:rFonts w:ascii="Calibri" w:hAnsi="Calibri"/>
-          <w:color w:val="666666"/>
-          <w:sz w:val="19"/>
-        </w:rPr>
-        <w:t xml:space="preserve">  (Octubre 2023 – Mayo 2025)</w:t>
-      </w:r>
-    </w:p>
-    <w:p>
-      <w:pPr>
-        <w:spacing w:before="20" w:after="20"/>
-        <w:ind w:left="720" w:hanging="288"/>
-      </w:pPr>
-      <w:r>
-        <w:rPr>
-          <w:rFonts w:ascii="Calibri" w:hAnsi="Calibri"/>
-          <w:color w:val="2E86AB"/>
-          <w:sz w:val="14"/>
-        </w:rPr>
-        <w:t xml:space="preserve">▪  </w:t>
-      </w:r>
-      <w:r>
-        <w:rPr>
-          <w:rFonts w:ascii="Calibri" w:hAnsi="Calibri"/>
-          <w:color w:val="333333"/>
-          <w:sz w:val="20"/>
-        </w:rPr>
-        <w:t>Dirección y coordinación integral de las operaciones de los distritos técnicos a nivel departamental.</w:t>
-      </w:r>
-    </w:p>
-    <w:p>
-      <w:pPr>
-        <w:spacing w:before="20" w:after="20"/>
-        <w:ind w:left="720" w:hanging="288"/>
-      </w:pPr>
-      <w:r>
-        <w:rPr>
-          <w:rFonts w:ascii="Calibri" w:hAnsi="Calibri"/>
-          <w:color w:val="2E86AB"/>
-          <w:sz w:val="14"/>
-        </w:rPr>
-        <w:t xml:space="preserve">▪  </w:t>
-      </w:r>
-      <w:r>
-        <w:rPr>
-          <w:rFonts w:ascii="Calibri" w:hAnsi="Calibri"/>
-          <w:color w:val="333333"/>
-          <w:sz w:val="20"/>
-        </w:rPr>
-        <w:t>Supervisión del cumplimiento normativo y regulatorio de operadores del sector.</w:t>
-      </w:r>
-    </w:p>
-    <w:p>
-      <w:pPr>
-        <w:spacing w:before="20" w:after="20"/>
-        <w:ind w:left="720" w:hanging="288"/>
-      </w:pPr>
-      <w:r>
-        <w:rPr>
-          <w:rFonts w:ascii="Calibri" w:hAnsi="Calibri"/>
-          <w:color w:val="2E86AB"/>
-          <w:sz w:val="14"/>
-        </w:rPr>
-        <w:t xml:space="preserve">▪  </w:t>
-      </w:r>
-      <w:r>
-        <w:rPr>
-          <w:rFonts w:ascii="Calibri" w:hAnsi="Calibri"/>
-          <w:color w:val="333333"/>
-          <w:sz w:val="20"/>
-        </w:rPr>
-        <w:t>Gestión y liderazgo de equipos multidisciplinarios en múltiples distritos.</w:t>
-      </w:r>
-    </w:p>
-    <w:p>
-      <w:pPr>
-        <w:spacing w:before="20" w:after="20"/>
-        <w:ind w:left="720" w:hanging="288"/>
-      </w:pPr>
-      <w:r>
-        <w:rPr>
-          <w:rFonts w:ascii="Calibri" w:hAnsi="Calibri"/>
-          <w:color w:val="2E86AB"/>
-          <w:sz w:val="14"/>
-        </w:rPr>
-        <w:t xml:space="preserve">▪  </w:t>
-      </w:r>
-      <w:r>
-        <w:rPr>
-          <w:rFonts w:ascii="Calibri" w:hAnsi="Calibri"/>
-          <w:color w:val="333333"/>
-          <w:sz w:val="20"/>
-        </w:rPr>
-        <w:t>Planificación estratégica de actividades de fiscalización e inspección distrital.</w:t>
-      </w:r>
-    </w:p>
-    <w:p>
-      <w:pPr>
-        <w:spacing w:before="20" w:after="20"/>
-        <w:ind w:left="720" w:hanging="288"/>
-      </w:pPr>
-      <w:r>
-        <w:rPr>
-          <w:rFonts w:ascii="Calibri" w:hAnsi="Calibri"/>
-          <w:color w:val="2E86AB"/>
-          <w:sz w:val="14"/>
-        </w:rPr>
-        <w:t xml:space="preserve">▪  </w:t>
-      </w:r>
-      <w:r>
-        <w:rPr>
-          <w:rFonts w:ascii="Calibri" w:hAnsi="Calibri"/>
-          <w:color w:val="333333"/>
-          <w:sz w:val="20"/>
-        </w:rPr>
-        <w:t>Toma de decisiones de alto nivel sobre procedimientos técnicos y administrativos.</w:t>
-      </w:r>
-    </w:p>
-    <w:p>
-      <w:pPr>
-        <w:spacing w:before="120" w:after="40"/>
-        <w:ind w:left="288"/>
-      </w:pPr>
-      <w:r>
-        <w:rPr>
-          <w:color w:val="2E86AB"/>
-          <w:sz w:val="18"/>
-        </w:rPr>
-        <w:t xml:space="preserve">▸ </w:t>
-      </w:r>
-      <w:r>
-        <w:rPr>
-          <w:rFonts w:ascii="Calibri" w:hAnsi="Calibri"/>
-          <w:b/>
-          <w:color w:val="0F2B46"/>
-          <w:sz w:val="20"/>
-        </w:rPr>
-        <w:t>Jefe de Unidad de Control, Supervisión de Riesgos y Contabilidad de Negocio</w:t>
-      </w:r>
-      <w:r>
-        <w:rPr>
-          <w:rFonts w:ascii="Calibri" w:hAnsi="Calibri"/>
-          <w:color w:val="666666"/>
-          <w:sz w:val="19"/>
-        </w:rPr>
-        <w:t xml:space="preserve">  (Mayo 2021 – Octubre 2023)</w:t>
-      </w:r>
-    </w:p>
-    <w:p>
-      <w:pPr>
-        <w:spacing w:before="20" w:after="20"/>
-        <w:ind w:left="720" w:hanging="288"/>
-      </w:pPr>
-      <w:r>
-        <w:rPr>
-          <w:rFonts w:ascii="Calibri" w:hAnsi="Calibri"/>
-          <w:color w:val="2E86AB"/>
-          <w:sz w:val="14"/>
-        </w:rPr>
-        <w:t xml:space="preserve">▪  </w:t>
-      </w:r>
-      <w:r>
-        <w:rPr>
-          <w:rFonts w:ascii="Calibri" w:hAnsi="Calibri"/>
-          <w:color w:val="333333"/>
-          <w:sz w:val="20"/>
-        </w:rPr>
-        <w:t>Liderazgo de la unidad responsable del control y supervisión de riesgos del sector regulado.</w:t>
-      </w:r>
-    </w:p>
-    <w:p>
-      <w:pPr>
-        <w:spacing w:before="20" w:after="20"/>
-        <w:ind w:left="720" w:hanging="288"/>
-      </w:pPr>
-      <w:r>
-        <w:rPr>
-          <w:rFonts w:ascii="Calibri" w:hAnsi="Calibri"/>
-          <w:color w:val="2E86AB"/>
-          <w:sz w:val="14"/>
-        </w:rPr>
-        <w:t xml:space="preserve">▪  </w:t>
-      </w:r>
-      <w:r>
-        <w:rPr>
-          <w:rFonts w:ascii="Calibri" w:hAnsi="Calibri"/>
-          <w:color w:val="333333"/>
-          <w:sz w:val="20"/>
-        </w:rPr>
-        <w:t>Implementación y seguimiento de sistemas de gestión de riesgos institucional.</w:t>
-      </w:r>
-    </w:p>
-    <w:p>
-      <w:pPr>
-        <w:spacing w:before="20" w:after="20"/>
-        <w:ind w:left="720" w:hanging="288"/>
-      </w:pPr>
-      <w:r>
-        <w:rPr>
-          <w:rFonts w:ascii="Calibri" w:hAnsi="Calibri"/>
-          <w:color w:val="2E86AB"/>
-          <w:sz w:val="14"/>
-        </w:rPr>
-        <w:t xml:space="preserve">▪  </w:t>
-      </w:r>
-      <w:r>
-        <w:rPr>
-          <w:rFonts w:ascii="Calibri" w:hAnsi="Calibri"/>
-          <w:color w:val="333333"/>
-          <w:sz w:val="20"/>
-        </w:rPr>
-        <w:t>Supervisión de la contabilidad de negocio y análisis financiero del sector.</w:t>
-      </w:r>
-    </w:p>
-    <w:p>
-      <w:pPr>
-        <w:spacing w:before="20" w:after="20"/>
-        <w:ind w:left="720" w:hanging="288"/>
-      </w:pPr>
-      <w:r>
-        <w:rPr>
-          <w:rFonts w:ascii="Calibri" w:hAnsi="Calibri"/>
-          <w:color w:val="2E86AB"/>
-          <w:sz w:val="14"/>
-        </w:rPr>
-        <w:t xml:space="preserve">▪  </w:t>
-      </w:r>
-      <w:r>
-        <w:rPr>
-          <w:rFonts w:ascii="Calibri" w:hAnsi="Calibri"/>
-          <w:color w:val="333333"/>
-          <w:sz w:val="20"/>
-        </w:rPr>
-        <w:t>Elaboración de reportes gerenciales de control, seguimiento y evaluación.</w:t>
-      </w:r>
-    </w:p>
-    <w:p>
-      <w:pPr>
-        <w:spacing w:before="120" w:after="40"/>
-        <w:ind w:left="288"/>
-      </w:pPr>
-      <w:r>
-        <w:rPr>
-          <w:color w:val="2E86AB"/>
-          <w:sz w:val="18"/>
-        </w:rPr>
-        <w:t xml:space="preserve">▸ </w:t>
-      </w:r>
-      <w:r>
-        <w:rPr>
-          <w:rFonts w:ascii="Calibri" w:hAnsi="Calibri"/>
-          <w:b/>
-          <w:color w:val="0F2B46"/>
-          <w:sz w:val="20"/>
-        </w:rPr>
-        <w:t>Jefe de Unidad de Operación y Participación Energética</w:t>
-      </w:r>
-      <w:r>
-        <w:rPr>
-          <w:rFonts w:ascii="Calibri" w:hAnsi="Calibri"/>
-          <w:color w:val="666666"/>
-          <w:sz w:val="19"/>
-        </w:rPr>
-        <w:t xml:space="preserve">  (Febrero 2021 – Mayo 2021)</w:t>
-      </w:r>
-    </w:p>
-    <w:p>
-      <w:pPr>
-        <w:spacing w:before="20" w:after="20"/>
-        <w:ind w:left="720" w:hanging="288"/>
-      </w:pPr>
-      <w:r>
-        <w:rPr>
-          <w:rFonts w:ascii="Calibri" w:hAnsi="Calibri"/>
-          <w:color w:val="2E86AB"/>
-          <w:sz w:val="14"/>
-        </w:rPr>
-        <w:t xml:space="preserve">▪  </w:t>
-      </w:r>
-      <w:r>
-        <w:rPr>
-          <w:rFonts w:ascii="Calibri" w:hAnsi="Calibri"/>
-          <w:color w:val="333333"/>
-          <w:sz w:val="20"/>
-        </w:rPr>
-        <w:t>Coordinación de operaciones de participación energética a nivel departamental.</w:t>
-      </w:r>
-    </w:p>
-    <w:p>
-      <w:pPr>
-        <w:spacing w:before="20" w:after="20"/>
-        <w:ind w:left="720" w:hanging="288"/>
-      </w:pPr>
-      <w:r>
-        <w:rPr>
-          <w:rFonts w:ascii="Calibri" w:hAnsi="Calibri"/>
-          <w:color w:val="2E86AB"/>
-          <w:sz w:val="14"/>
-        </w:rPr>
-        <w:t xml:space="preserve">▪  </w:t>
-      </w:r>
-      <w:r>
-        <w:rPr>
-          <w:rFonts w:ascii="Calibri" w:hAnsi="Calibri"/>
-          <w:color w:val="333333"/>
-          <w:sz w:val="20"/>
-        </w:rPr>
-        <w:t>Gestión de procesos operativos del sector energético y regulación técnica.</w:t>
-      </w:r>
-    </w:p>
-    <w:p>
-      <w:pPr>
-        <w:spacing w:before="120" w:after="40"/>
-        <w:ind w:left="288"/>
-      </w:pPr>
-      <w:r>
-        <w:rPr>
-          <w:color w:val="2E86AB"/>
-          <w:sz w:val="18"/>
-        </w:rPr>
-        <w:t xml:space="preserve">▸ </w:t>
-      </w:r>
-      <w:r>
-        <w:rPr>
-          <w:rFonts w:ascii="Calibri" w:hAnsi="Calibri"/>
-          <w:b/>
-          <w:color w:val="0F2B46"/>
-          <w:sz w:val="20"/>
-        </w:rPr>
-        <w:t>Profesional de Operaciones / Responsable del Área Técnica</w:t>
-      </w:r>
-      <w:r>
-        <w:rPr>
-          <w:rFonts w:ascii="Calibri" w:hAnsi="Calibri"/>
-          <w:color w:val="666666"/>
-          <w:sz w:val="19"/>
-        </w:rPr>
-        <w:t xml:space="preserve">  (Junio 2018 – Enero 2021)</w:t>
-      </w:r>
-    </w:p>
-    <w:p>
-      <w:pPr>
-        <w:spacing w:before="20" w:after="20"/>
-        <w:ind w:left="720" w:hanging="288"/>
-      </w:pPr>
-      <w:r>
-        <w:rPr>
-          <w:rFonts w:ascii="Calibri" w:hAnsi="Calibri"/>
-          <w:color w:val="2E86AB"/>
-          <w:sz w:val="14"/>
-        </w:rPr>
-        <w:t xml:space="preserve">▪  </w:t>
-      </w:r>
-      <w:r>
-        <w:rPr>
-          <w:rFonts w:ascii="Calibri" w:hAnsi="Calibri"/>
-          <w:color w:val="333333"/>
-          <w:sz w:val="20"/>
-        </w:rPr>
-        <w:t>Designación como Responsable del Área Técnica del distrito (2020).</w:t>
-      </w:r>
-    </w:p>
-    <w:p>
-      <w:pPr>
-        <w:spacing w:before="20" w:after="20"/>
-        <w:ind w:left="720" w:hanging="288"/>
-      </w:pPr>
-      <w:r>
-        <w:rPr>
-          <w:rFonts w:ascii="Calibri" w:hAnsi="Calibri"/>
-          <w:color w:val="2E86AB"/>
-          <w:sz w:val="14"/>
-        </w:rPr>
-        <w:t xml:space="preserve">▪  </w:t>
-      </w:r>
-      <w:r>
-        <w:rPr>
-          <w:rFonts w:ascii="Calibri" w:hAnsi="Calibri"/>
-          <w:color w:val="333333"/>
-          <w:sz w:val="20"/>
-        </w:rPr>
-        <w:t>Gestión integral de operaciones en las direcciones Distrital y de Comercialización.</w:t>
-      </w:r>
-    </w:p>
-    <w:p>
-      <w:pPr>
-        <w:spacing w:before="20" w:after="20"/>
-        <w:ind w:left="720" w:hanging="288"/>
-      </w:pPr>
-      <w:r>
-        <w:rPr>
-          <w:rFonts w:ascii="Calibri" w:hAnsi="Calibri"/>
-          <w:color w:val="2E86AB"/>
-          <w:sz w:val="14"/>
-        </w:rPr>
-        <w:t xml:space="preserve">▪  </w:t>
-      </w:r>
-      <w:r>
-        <w:rPr>
-          <w:rFonts w:ascii="Calibri" w:hAnsi="Calibri"/>
-          <w:color w:val="333333"/>
-          <w:sz w:val="20"/>
-        </w:rPr>
-        <w:t>Supervisión técnica de actividades operativas y de fiscalización.</w:t>
-      </w:r>
-    </w:p>
-    <w:p>
-      <w:pPr>
-        <w:spacing w:before="20" w:after="20"/>
-        <w:ind w:left="720" w:hanging="288"/>
-      </w:pPr>
-      <w:r>
-        <w:rPr>
-          <w:rFonts w:ascii="Calibri" w:hAnsi="Calibri"/>
-          <w:color w:val="2E86AB"/>
-          <w:sz w:val="14"/>
-        </w:rPr>
-        <w:t xml:space="preserve">▪  </w:t>
-      </w:r>
-      <w:r>
-        <w:rPr>
-          <w:rFonts w:ascii="Calibri" w:hAnsi="Calibri"/>
-          <w:color w:val="333333"/>
-          <w:sz w:val="20"/>
-        </w:rPr>
-        <w:t>Coordinación interinstitucional con áreas de inspección, comercialización y control.</w:t>
-      </w:r>
-    </w:p>
-    <w:p>
-      <w:pPr>
-        <w:spacing w:before="120" w:after="40"/>
-        <w:ind w:left="288"/>
-      </w:pPr>
-      <w:r>
-        <w:rPr>
-          <w:color w:val="2E86AB"/>
-          <w:sz w:val="18"/>
-        </w:rPr>
-        <w:t xml:space="preserve">▸ </w:t>
-      </w:r>
-      <w:r>
-        <w:rPr>
-          <w:rFonts w:ascii="Calibri" w:hAnsi="Calibri"/>
-          <w:b/>
-          <w:color w:val="0F2B46"/>
-          <w:sz w:val="20"/>
-        </w:rPr>
-        <w:t>Profesional de Inspecciones</w:t>
-      </w:r>
-      <w:r>
-        <w:rPr>
-          <w:rFonts w:ascii="Calibri" w:hAnsi="Calibri"/>
-          <w:color w:val="666666"/>
-          <w:sz w:val="19"/>
-        </w:rPr>
-        <w:t xml:space="preserve">  (2016 – Junio 2018)</w:t>
-      </w:r>
-    </w:p>
-    <w:p>
-      <w:pPr>
-        <w:spacing w:before="20" w:after="20"/>
-        <w:ind w:left="720" w:hanging="288"/>
-      </w:pPr>
-      <w:r>
-        <w:rPr>
-          <w:rFonts w:ascii="Calibri" w:hAnsi="Calibri"/>
-          <w:color w:val="2E86AB"/>
-          <w:sz w:val="14"/>
-        </w:rPr>
-        <w:t xml:space="preserve">▪  </w:t>
-      </w:r>
-      <w:r>
-        <w:rPr>
-          <w:rFonts w:ascii="Calibri" w:hAnsi="Calibri"/>
-          <w:color w:val="333333"/>
-          <w:sz w:val="20"/>
-        </w:rPr>
-        <w:t>Ejecución de inspecciones técnicas en el marco del régimen regulatorio vigente.</w:t>
-      </w:r>
-    </w:p>
-    <w:p>
-      <w:pPr>
-        <w:spacing w:before="20" w:after="20"/>
-        <w:ind w:left="720" w:hanging="288"/>
-      </w:pPr>
-      <w:r>
-        <w:rPr>
-          <w:rFonts w:ascii="Calibri" w:hAnsi="Calibri"/>
-          <w:color w:val="2E86AB"/>
-          <w:sz w:val="14"/>
-        </w:rPr>
-        <w:t xml:space="preserve">▪  </w:t>
-      </w:r>
-      <w:r>
-        <w:rPr>
-          <w:rFonts w:ascii="Calibri" w:hAnsi="Calibri"/>
-          <w:color w:val="333333"/>
-          <w:sz w:val="20"/>
-        </w:rPr>
-        <w:t>Elaboración de informes técnicos de inspección y fiscalización.</w:t>
-      </w:r>
-    </w:p>
-    <w:p>
-      <w:pPr>
-        <w:spacing w:before="20" w:after="20"/>
-        <w:ind w:left="720" w:hanging="288"/>
-      </w:pPr>
-      <w:r>
-        <w:rPr>
-          <w:rFonts w:ascii="Calibri" w:hAnsi="Calibri"/>
-          <w:color w:val="2E86AB"/>
-          <w:sz w:val="14"/>
-        </w:rPr>
-        <w:t xml:space="preserve">▪  </w:t>
-      </w:r>
-      <w:r>
-        <w:rPr>
-          <w:rFonts w:ascii="Calibri" w:hAnsi="Calibri"/>
-          <w:color w:val="333333"/>
-          <w:sz w:val="20"/>
-        </w:rPr>
-        <w:t>Verificación in situ del cumplimiento normativo de operadores regulados.</w:t>
-      </w:r>
-    </w:p>
-    <w:p>
-      <w:pPr>
-        <w:spacing w:before="120" w:after="40"/>
-        <w:ind w:left="288"/>
-      </w:pPr>
-      <w:r>
-        <w:rPr>
-          <w:color w:val="2E86AB"/>
-          <w:sz w:val="18"/>
-        </w:rPr>
-        <w:t xml:space="preserve">▸ </w:t>
-      </w:r>
-      <w:r>
-        <w:rPr>
-          <w:rFonts w:ascii="Calibri" w:hAnsi="Calibri"/>
-          <w:b/>
-          <w:color w:val="0F2B46"/>
-          <w:sz w:val="20"/>
-        </w:rPr>
-        <w:t>Asistente / Auxiliar de Inspecciones</w:t>
-      </w:r>
-      <w:r>
-        <w:rPr>
-          <w:rFonts w:ascii="Calibri" w:hAnsi="Calibri"/>
-          <w:color w:val="666666"/>
-          <w:sz w:val="19"/>
-        </w:rPr>
-        <w:t xml:space="preserve">  (2014 – 2016)</w:t>
-      </w:r>
-    </w:p>
-    <w:p>
-      <w:pPr>
-        <w:spacing w:before="20" w:after="20"/>
-        <w:ind w:left="720" w:hanging="288"/>
-      </w:pPr>
-      <w:r>
-        <w:rPr>
-          <w:rFonts w:ascii="Calibri" w:hAnsi="Calibri"/>
-          <w:color w:val="2E86AB"/>
-          <w:sz w:val="14"/>
-        </w:rPr>
-        <w:t xml:space="preserve">▪  </w:t>
-      </w:r>
-      <w:r>
-        <w:rPr>
-          <w:rFonts w:ascii="Calibri" w:hAnsi="Calibri"/>
-          <w:color w:val="333333"/>
-          <w:sz w:val="20"/>
-        </w:rPr>
-        <w:t>Apoyo técnico en procesos de inspección, fiscalización y control.</w:t>
-      </w:r>
-    </w:p>
-    <w:p>
-      <w:pPr>
-        <w:spacing w:before="20" w:after="20"/>
-        <w:ind w:left="720" w:hanging="288"/>
-      </w:pPr>
-      <w:r>
-        <w:rPr>
-          <w:rFonts w:ascii="Calibri" w:hAnsi="Calibri"/>
-          <w:color w:val="2E86AB"/>
-          <w:sz w:val="14"/>
-        </w:rPr>
-        <w:t xml:space="preserve">▪  </w:t>
-      </w:r>
-      <w:r>
-        <w:rPr>
-          <w:rFonts w:ascii="Calibri" w:hAnsi="Calibri"/>
-          <w:color w:val="333333"/>
-          <w:sz w:val="20"/>
-        </w:rPr>
-        <w:t>Recopilación, análisis y sistematización de información técnica.</w:t>
-      </w:r>
-    </w:p>
-    <w:p>
-      <w:pPr>
-        <w:spacing w:before="20" w:after="20"/>
-        <w:ind w:left="720" w:hanging="288"/>
-      </w:pPr>
-      <w:r>
-        <w:rPr>
-          <w:rFonts w:ascii="Calibri" w:hAnsi="Calibri"/>
-          <w:color w:val="2E86AB"/>
-          <w:sz w:val="14"/>
-        </w:rPr>
-        <w:t xml:space="preserve">▪  </w:t>
-      </w:r>
-      <w:r>
-        <w:rPr>
-          <w:rFonts w:ascii="Calibri" w:hAnsi="Calibri"/>
-          <w:color w:val="333333"/>
-          <w:sz w:val="20"/>
-        </w:rPr>
-        <w:t>Elaboración de documentación de respaldo y seguimiento de expedientes.</w:t>
-      </w:r>
-    </w:p>
-    <w:p>
-      <w:pPr>
-        <w:spacing w:before="80" w:after="80"/>
-        <w:pBdr>
-          <w:bottom w:val="single" w:sz="4" w:space="1" w:color="2E86AB"/>
-        </w:pBdr>
-      </w:pPr>
-    </w:p>
-    <w:p>
-      <w:pPr>
-        <w:spacing w:before="160" w:after="20"/>
-      </w:pPr>
-      <w:r>
-        <w:rPr>
-          <w:rFonts w:ascii="Calibri" w:hAnsi="Calibri"/>
-          <w:b/>
-          <w:color w:val="0F2B46"/>
-          <w:sz w:val="22"/>
-        </w:rPr>
-        <w:t>Técnico II</w:t>
-      </w:r>
-      <w:r>
-        <w:rPr>
-          <w:rFonts w:ascii="Calibri" w:hAnsi="Calibri"/>
-          <w:b/>
-          <w:color w:val="2E86AB"/>
-          <w:sz w:val="20"/>
-        </w:rPr>
-        <w:t xml:space="preserve">  |  Enero 2014 – Marzo 2014</w:t>
-      </w:r>
-    </w:p>
-    <w:p>
-      <w:pPr>
-        <w:spacing w:before="0" w:after="60"/>
-      </w:pPr>
-      <w:r>
-        <w:rPr>
-          <w:rFonts w:ascii="Calibri" w:hAnsi="Calibri"/>
-          <w:i/>
-          <w:color w:val="666666"/>
-          <w:sz w:val="20"/>
-        </w:rPr>
-        <w:t>Secretaría de Medio Ambiente, Gobierno Autónomo Municipal de Santa Cruz (GAMSCZ)</w:t>
-      </w:r>
-      <w:r>
-        <w:rPr>
-          <w:rFonts w:ascii="Calibri" w:hAnsi="Calibri"/>
-          <w:i/>
-          <w:color w:val="666666"/>
-          <w:sz w:val="20"/>
-        </w:rPr>
-        <w:t xml:space="preserve">  •  Santa Cruz, Bolivia</w:t>
-      </w:r>
-    </w:p>
-    <w:p>
-      <w:pPr>
-        <w:spacing w:before="20" w:after="20"/>
-        <w:ind w:left="720" w:hanging="288"/>
-      </w:pPr>
-      <w:r>
-        <w:rPr>
-          <w:rFonts w:ascii="Calibri" w:hAnsi="Calibri"/>
-          <w:color w:val="2E86AB"/>
-          <w:sz w:val="14"/>
-        </w:rPr>
-        <w:t xml:space="preserve">▪  </w:t>
-      </w:r>
-      <w:r>
-        <w:rPr>
-          <w:rFonts w:ascii="Calibri" w:hAnsi="Calibri"/>
-          <w:color w:val="333333"/>
-          <w:sz w:val="20"/>
-        </w:rPr>
-        <w:t>Apoyo técnico en procesos de gestión y fiscalización ambiental municipal.</w:t>
-      </w:r>
-    </w:p>
-    <w:p>
-      <w:pPr>
-        <w:spacing w:before="20" w:after="20"/>
-        <w:ind w:left="720" w:hanging="288"/>
-      </w:pPr>
-      <w:r>
-        <w:rPr>
-          <w:rFonts w:ascii="Calibri" w:hAnsi="Calibri"/>
-          <w:color w:val="2E86AB"/>
-          <w:sz w:val="14"/>
-        </w:rPr>
-        <w:t xml:space="preserve">▪  </w:t>
-      </w:r>
-      <w:r>
-        <w:rPr>
-          <w:rFonts w:ascii="Calibri" w:hAnsi="Calibri"/>
-          <w:color w:val="333333"/>
-          <w:sz w:val="20"/>
-        </w:rPr>
-        <w:t>Participación en actividades de control y seguimiento ambiental.</w:t>
-      </w:r>
-    </w:p>
-    <w:p>
-      <w:pPr>
-        <w:spacing w:before="80" w:after="80"/>
-        <w:pBdr>
-          <w:bottom w:val="single" w:sz="4" w:space="1" w:color="2E86AB"/>
-        </w:pBdr>
-      </w:pPr>
-    </w:p>
-    <w:p>
-      <w:pPr>
-        <w:spacing w:before="160" w:after="20"/>
-      </w:pPr>
-      <w:r>
-        <w:rPr>
-          <w:rFonts w:ascii="Calibri" w:hAnsi="Calibri"/>
-          <w:b/>
-          <w:color w:val="0F2B46"/>
-          <w:sz w:val="22"/>
-        </w:rPr>
-        <w:t>Supervisor QHSE (Calidad, Salud, Seguridad y Medio Ambiente)</w:t>
-      </w:r>
-      <w:r>
-        <w:rPr>
-          <w:rFonts w:ascii="Calibri" w:hAnsi="Calibri"/>
-          <w:b/>
-          <w:color w:val="2E86AB"/>
-          <w:sz w:val="20"/>
-        </w:rPr>
-        <w:t xml:space="preserve">  |  Diciembre 2012 – 2013</w:t>
-      </w:r>
-    </w:p>
-    <w:p>
-      <w:pPr>
-        <w:spacing w:before="0" w:after="60"/>
-      </w:pPr>
-      <w:r>
-        <w:rPr>
-          <w:rFonts w:ascii="Calibri" w:hAnsi="Calibri"/>
-          <w:i/>
-          <w:color w:val="666666"/>
-          <w:sz w:val="20"/>
-        </w:rPr>
-        <w:t>EMALINPER CATERING</w:t>
-      </w:r>
-      <w:r>
-        <w:rPr>
-          <w:rFonts w:ascii="Calibri" w:hAnsi="Calibri"/>
-          <w:i/>
-          <w:color w:val="666666"/>
-          <w:sz w:val="20"/>
-        </w:rPr>
-        <w:t xml:space="preserve">  •  Santa Cruz, Bolivia</w:t>
-      </w:r>
-    </w:p>
-    <w:p>
-      <w:pPr>
-        <w:spacing w:before="20" w:after="20"/>
-        <w:ind w:left="720" w:hanging="288"/>
-      </w:pPr>
-      <w:r>
-        <w:rPr>
-          <w:rFonts w:ascii="Calibri" w:hAnsi="Calibri"/>
-          <w:color w:val="2E86AB"/>
-          <w:sz w:val="14"/>
-        </w:rPr>
-        <w:t xml:space="preserve">▪  </w:t>
-      </w:r>
-      <w:r>
-        <w:rPr>
-          <w:rFonts w:ascii="Calibri" w:hAnsi="Calibri"/>
-          <w:color w:val="333333"/>
-          <w:sz w:val="20"/>
-        </w:rPr>
-        <w:t>Supervisión integral de Calidad, Higiene, Seguridad y Medio Ambiente en campamentos petroleros.</w:t>
-      </w:r>
-    </w:p>
-    <w:p>
-      <w:pPr>
-        <w:spacing w:before="20" w:after="20"/>
-        <w:ind w:left="720" w:hanging="288"/>
-      </w:pPr>
-      <w:r>
-        <w:rPr>
-          <w:rFonts w:ascii="Calibri" w:hAnsi="Calibri"/>
-          <w:color w:val="2E86AB"/>
-          <w:sz w:val="14"/>
-        </w:rPr>
-        <w:t xml:space="preserve">▪  </w:t>
-      </w:r>
-      <w:r>
-        <w:rPr>
-          <w:rFonts w:ascii="Calibri" w:hAnsi="Calibri"/>
-          <w:color w:val="333333"/>
-          <w:sz w:val="20"/>
-        </w:rPr>
-        <w:t>Campamentos: Río Grande-85 (YPFB Andina) y Margarita X-5 / X-6 (Repsol YPF).</w:t>
-      </w:r>
-    </w:p>
-    <w:p>
-      <w:pPr>
-        <w:spacing w:before="20" w:after="20"/>
-        <w:ind w:left="720" w:hanging="288"/>
-      </w:pPr>
-      <w:r>
-        <w:rPr>
-          <w:rFonts w:ascii="Calibri" w:hAnsi="Calibri"/>
-          <w:color w:val="2E86AB"/>
-          <w:sz w:val="14"/>
-        </w:rPr>
-        <w:t xml:space="preserve">▪  </w:t>
-      </w:r>
-      <w:r>
-        <w:rPr>
-          <w:rFonts w:ascii="Calibri" w:hAnsi="Calibri"/>
-          <w:color w:val="333333"/>
-          <w:sz w:val="20"/>
-        </w:rPr>
-        <w:t>Implementación de protocolos QHSE y control de indicadores de seguridad industrial.</w:t>
-      </w:r>
-    </w:p>
-    <w:p>
-      <w:pPr>
-        <w:spacing w:before="20" w:after="20"/>
-        <w:ind w:left="720" w:hanging="288"/>
-      </w:pPr>
-      <w:r>
-        <w:rPr>
-          <w:rFonts w:ascii="Calibri" w:hAnsi="Calibri"/>
-          <w:color w:val="2E86AB"/>
-          <w:sz w:val="14"/>
-        </w:rPr>
-        <w:t xml:space="preserve">▪  </w:t>
-      </w:r>
-      <w:r>
-        <w:rPr>
-          <w:rFonts w:ascii="Calibri" w:hAnsi="Calibri"/>
-          <w:color w:val="333333"/>
-          <w:sz w:val="20"/>
-        </w:rPr>
-        <w:t>Gestión de residuos y cumplimiento de normativa ambiental en operaciones de campo.</w:t>
-      </w:r>
-    </w:p>
-    <w:p>
-      <w:pPr>
-        <w:spacing w:before="80" w:after="80"/>
-        <w:pBdr>
-          <w:bottom w:val="single" w:sz="4" w:space="1" w:color="2E86AB"/>
-        </w:pBdr>
-      </w:pPr>
-    </w:p>
-    <w:p>
-      <w:pPr>
-        <w:spacing w:before="160" w:after="20"/>
-      </w:pPr>
-      <w:r>
-        <w:rPr>
-          <w:rFonts w:ascii="Calibri" w:hAnsi="Calibri"/>
-          <w:b/>
-          <w:color w:val="0F2B46"/>
-          <w:sz w:val="22"/>
-        </w:rPr>
-        <w:t>Técnico en Monitoreo Ambiental</w:t>
-      </w:r>
-      <w:r>
-        <w:rPr>
-          <w:rFonts w:ascii="Calibri" w:hAnsi="Calibri"/>
-          <w:b/>
-          <w:color w:val="2E86AB"/>
-          <w:sz w:val="20"/>
-        </w:rPr>
-        <w:t xml:space="preserve">  |  Noviembre 2012</w:t>
-      </w:r>
-    </w:p>
-    <w:p>
-      <w:pPr>
-        <w:spacing w:before="0" w:after="60"/>
-      </w:pPr>
-      <w:r>
-        <w:rPr>
-          <w:rFonts w:ascii="Calibri" w:hAnsi="Calibri"/>
-          <w:i/>
-          <w:color w:val="666666"/>
-          <w:sz w:val="20"/>
-        </w:rPr>
-        <w:t>Consultora Ambiental y Proyectos Integrales GUAYABOCHI S.R.L.</w:t>
-      </w:r>
-      <w:r>
-        <w:rPr>
-          <w:rFonts w:ascii="Calibri" w:hAnsi="Calibri"/>
-          <w:i/>
-          <w:color w:val="666666"/>
-          <w:sz w:val="20"/>
-        </w:rPr>
-        <w:t xml:space="preserve">  •  Santa Cruz, Bolivia</w:t>
-      </w:r>
-    </w:p>
-    <w:p>
-      <w:pPr>
-        <w:spacing w:before="20" w:after="20"/>
-        <w:ind w:left="720" w:hanging="288"/>
-      </w:pPr>
-      <w:r>
-        <w:rPr>
-          <w:rFonts w:ascii="Calibri" w:hAnsi="Calibri"/>
-          <w:color w:val="2E86AB"/>
-          <w:sz w:val="14"/>
-        </w:rPr>
-        <w:t xml:space="preserve">▪  </w:t>
-      </w:r>
-      <w:r>
-        <w:rPr>
-          <w:rFonts w:ascii="Calibri" w:hAnsi="Calibri"/>
-          <w:color w:val="333333"/>
-          <w:sz w:val="20"/>
-        </w:rPr>
-        <w:t>Monitoreo ambiental a radio bases de Telecel S.A. en los departamentos de Cochabamba y Chuquisaca.</w:t>
-      </w:r>
-    </w:p>
-    <w:p>
-      <w:pPr>
-        <w:spacing w:before="80" w:after="80"/>
-        <w:pBdr>
-          <w:bottom w:val="single" w:sz="4" w:space="1" w:color="2E86AB"/>
-        </w:pBdr>
-      </w:pPr>
-    </w:p>
-    <w:p>
-      <w:pPr>
-        <w:spacing w:before="160" w:after="20"/>
-      </w:pPr>
-      <w:r>
-        <w:rPr>
-          <w:rFonts w:ascii="Calibri" w:hAnsi="Calibri"/>
-          <w:b/>
-          <w:color w:val="0F2B46"/>
-          <w:sz w:val="22"/>
-        </w:rPr>
-        <w:t>Prácticas Profesionales</w:t>
-      </w:r>
-      <w:r>
-        <w:rPr>
-          <w:rFonts w:ascii="Calibri" w:hAnsi="Calibri"/>
-          <w:b/>
-          <w:color w:val="2E86AB"/>
-          <w:sz w:val="20"/>
-        </w:rPr>
-        <w:t xml:space="preserve">  |  Julio – Agosto 2012</w:t>
-      </w:r>
-    </w:p>
-    <w:p>
-      <w:pPr>
-        <w:spacing w:before="0" w:after="60"/>
-      </w:pPr>
-      <w:r>
-        <w:rPr>
-          <w:rFonts w:ascii="Calibri" w:hAnsi="Calibri"/>
-          <w:i/>
-          <w:color w:val="666666"/>
-          <w:sz w:val="20"/>
-        </w:rPr>
-        <w:t>Autoridad de Fiscalización y Control Social de Bosques y Tierra (ABT)</w:t>
-      </w:r>
-      <w:r>
-        <w:rPr>
-          <w:rFonts w:ascii="Calibri" w:hAnsi="Calibri"/>
-          <w:i/>
-          <w:color w:val="666666"/>
-          <w:sz w:val="20"/>
-        </w:rPr>
-        <w:t xml:space="preserve">  •  Santa Cruz, Bolivia</w:t>
-      </w:r>
-    </w:p>
-    <w:p>
-      <w:pPr>
-        <w:spacing w:before="20" w:after="20"/>
-        <w:ind w:left="720" w:hanging="288"/>
-      </w:pPr>
-      <w:r>
-        <w:rPr>
-          <w:rFonts w:ascii="Calibri" w:hAnsi="Calibri"/>
-          <w:color w:val="2E86AB"/>
-          <w:sz w:val="14"/>
-        </w:rPr>
-        <w:t xml:space="preserve">▪  </w:t>
-      </w:r>
-      <w:r>
-        <w:rPr>
-          <w:rFonts w:ascii="Calibri" w:hAnsi="Calibri"/>
-          <w:color w:val="333333"/>
-          <w:sz w:val="20"/>
-        </w:rPr>
-        <w:t>Análisis e interpretación de deforestación a nivel nacional mediante imágenes satelitales.</w:t>
-      </w:r>
-    </w:p>
-    <w:p>
-      <w:pPr>
-        <w:spacing w:before="20" w:after="20"/>
-        <w:ind w:left="720" w:hanging="288"/>
-      </w:pPr>
-      <w:r>
-        <w:rPr>
-          <w:rFonts w:ascii="Calibri" w:hAnsi="Calibri"/>
-          <w:color w:val="2E86AB"/>
-          <w:sz w:val="14"/>
-        </w:rPr>
-        <w:t xml:space="preserve">▪  </w:t>
-      </w:r>
-      <w:r>
-        <w:rPr>
-          <w:rFonts w:ascii="Calibri" w:hAnsi="Calibri"/>
-          <w:color w:val="333333"/>
-          <w:sz w:val="20"/>
-        </w:rPr>
-        <w:t>Aplicación de técnicas de teledetección y procesamiento de datos geoespaciales.</w:t>
-      </w:r>
-    </w:p>
-    <w:p>
-      <w:r>
-        <w:br w:type="page"/>
-      </w:r>
-    </w:p>
-    <w:p>
-      <w:pPr>
-        <w:spacing w:before="280" w:after="40"/>
-      </w:pPr>
-      <w:r>
-        <w:rPr>
-          <w:rFonts w:ascii="Calibri" w:hAnsi="Calibri"/>
-          <w:b/>
-          <w:color w:val="1B3A5C"/>
-          <w:sz w:val="24"/>
-          <w:spacing w:val="40"/>
-        </w:rPr>
-        <w:t>FORMACIÓN ACADÉMICA</w:t>
-      </w:r>
-    </w:p>
-    <w:p>
-      <w:pPr>
-        <w:spacing w:before="40" w:after="120"/>
-        <w:pBdr>
-          <w:bottom w:val="single" w:sz="4" w:space="1" w:color="1B3A5C"/>
-        </w:pBdr>
-      </w:pPr>
-    </w:p>
-    <w:p>
-      <w:pPr>
-        <w:spacing w:before="120" w:after="20"/>
-      </w:pPr>
-      <w:r>
-        <w:rPr>
-          <w:rFonts w:ascii="Calibri" w:hAnsi="Calibri"/>
-          <w:b/>
-          <w:color w:val="0F2B46"/>
-          <w:sz w:val="22"/>
-        </w:rPr>
-        <w:t>Diplomado en Diseño de Plantas de Tratamiento de Residuos</w:t>
-      </w:r>
-    </w:p>
-    <w:p>
-      <w:pPr>
-        <w:spacing w:before="0" w:after="120"/>
-      </w:pPr>
-      <w:r>
-        <w:rPr>
-          <w:rFonts w:ascii="Calibri" w:hAnsi="Calibri"/>
-          <w:i/>
-          <w:color w:val="666666"/>
-          <w:sz w:val="20"/>
-        </w:rPr>
-        <w:t>Unidad de Postgrado, Facultad de Tecnología – Universidad Autónoma Gabriel René Moreno</w:t>
-      </w:r>
-    </w:p>
-    <w:p>
-      <w:pPr>
-        <w:spacing w:before="80" w:after="20"/>
-      </w:pPr>
-      <w:r>
-        <w:rPr>
-          <w:rFonts w:ascii="Calibri" w:hAnsi="Calibri"/>
-          <w:b/>
-          <w:color w:val="0F2B46"/>
-          <w:sz w:val="22"/>
-        </w:rPr>
-        <w:t>Licenciatura en Ingeniería Ambiental</w:t>
-      </w:r>
-      <w:r>
-        <w:rPr>
-          <w:rFonts w:ascii="Calibri" w:hAnsi="Calibri"/>
-          <w:b/>
-          <w:color w:val="2E86AB"/>
-          <w:sz w:val="20"/>
-        </w:rPr>
-        <w:t xml:space="preserve">  |  Titulado, 2012</w:t>
-      </w:r>
-    </w:p>
-    <w:p>
-      <w:pPr>
-        <w:spacing w:before="0" w:after="120"/>
-      </w:pPr>
-      <w:r>
-        <w:rPr>
-          <w:rFonts w:ascii="Calibri" w:hAnsi="Calibri"/>
-          <w:i/>
-          <w:color w:val="666666"/>
-          <w:sz w:val="20"/>
-        </w:rPr>
-        <w:t>Universidad Autónoma Gabriel René Moreno – Santa Cruz, Bolivia</w:t>
-      </w:r>
-    </w:p>
-    <w:p>
-      <w:pPr>
-        <w:spacing w:before="80" w:after="20"/>
-      </w:pPr>
-      <w:r>
-        <w:rPr>
-          <w:rFonts w:ascii="Calibri" w:hAnsi="Calibri"/>
-          <w:b/>
-          <w:color w:val="0F2B46"/>
-          <w:sz w:val="22"/>
-        </w:rPr>
-        <w:t>Bachiller en Humanidades</w:t>
-      </w:r>
-      <w:r>
-        <w:rPr>
-          <w:rFonts w:ascii="Calibri" w:hAnsi="Calibri"/>
-          <w:b/>
-          <w:color w:val="2E86AB"/>
-          <w:sz w:val="20"/>
-        </w:rPr>
-        <w:t xml:space="preserve">  |  2005</w:t>
-      </w:r>
-    </w:p>
-    <w:p>
-      <w:pPr>
-        <w:spacing w:before="0" w:after="120"/>
-      </w:pPr>
-      <w:r>
-        <w:rPr>
-          <w:rFonts w:ascii="Calibri" w:hAnsi="Calibri"/>
-          <w:i/>
-          <w:color w:val="666666"/>
-          <w:sz w:val="20"/>
-        </w:rPr>
-        <w:t>Colegio Evangélico Río Nuevo – Santa Cruz, Bolivia</w:t>
-      </w:r>
-    </w:p>
-    <w:p>
-      <w:pPr>
-        <w:spacing w:before="280" w:after="40"/>
-      </w:pPr>
-      <w:r>
-        <w:rPr>
-          <w:rFonts w:ascii="Calibri" w:hAnsi="Calibri"/>
-          <w:b/>
-          <w:color w:val="1B3A5C"/>
-          <w:sz w:val="24"/>
-          <w:spacing w:val="40"/>
-        </w:rPr>
-        <w:t>FORMACIÓN COMPLEMENTARIA Y CERTIFICACIONES</w:t>
-      </w:r>
-    </w:p>
-    <w:p>
-      <w:pPr>
-        <w:spacing w:before="40" w:after="120"/>
-        <w:pBdr>
-          <w:bottom w:val="single" w:sz="4" w:space="1" w:color="1B3A5C"/>
-        </w:pBdr>
-      </w:pPr>
-    </w:p>
-    <w:p>
-      <w:pPr>
-        <w:spacing w:before="80" w:after="20"/>
-        <w:ind w:left="288"/>
-      </w:pPr>
-      <w:r>
-        <w:rPr>
-          <w:color w:val="2E86AB"/>
-          <w:sz w:val="14"/>
-        </w:rPr>
-        <w:t xml:space="preserve">▪  </w:t>
-      </w:r>
-      <w:r>
-        <w:rPr>
-          <w:rFonts w:ascii="Calibri" w:hAnsi="Calibri"/>
-          <w:b/>
-          <w:color w:val="0F2B46"/>
-          <w:sz w:val="20"/>
-        </w:rPr>
-        <w:t>Especialista en Sistemas de Gestión de Salud y Seguridad Ocupacional NB OHSAS 18001</w:t>
-      </w:r>
-    </w:p>
-    <w:p>
-      <w:pPr>
-        <w:spacing w:before="0" w:after="40"/>
-        <w:ind w:left="576"/>
-      </w:pPr>
-      <w:r>
-        <w:rPr>
-          <w:rFonts w:ascii="Calibri" w:hAnsi="Calibri"/>
-          <w:i/>
-          <w:color w:val="666666"/>
-          <w:sz w:val="18"/>
-        </w:rPr>
-        <w:t>Instituto Boliviano de Normalización y Calidad (IBNORCA)  |  Sep – Dic 2012</w:t>
-      </w:r>
-    </w:p>
-    <w:p>
-      <w:pPr>
-        <w:spacing w:before="80" w:after="20"/>
-        <w:ind w:left="288"/>
-      </w:pPr>
-      <w:r>
-        <w:rPr>
-          <w:color w:val="2E86AB"/>
-          <w:sz w:val="14"/>
-        </w:rPr>
-        <w:t xml:space="preserve">▪  </w:t>
-      </w:r>
-      <w:r>
-        <w:rPr>
-          <w:rFonts w:ascii="Calibri" w:hAnsi="Calibri"/>
-          <w:b/>
-          <w:color w:val="0F2B46"/>
-          <w:sz w:val="20"/>
-        </w:rPr>
-        <w:t>Seguridad Industrial, Medio Ambiente y Salud</w:t>
-      </w:r>
-    </w:p>
-    <w:p>
-      <w:pPr>
-        <w:spacing w:before="0" w:after="40"/>
-        <w:ind w:left="576"/>
-      </w:pPr>
-      <w:r>
-        <w:rPr>
-          <w:rFonts w:ascii="Calibri" w:hAnsi="Calibri"/>
-          <w:i/>
-          <w:color w:val="666666"/>
-          <w:sz w:val="18"/>
-        </w:rPr>
-        <w:t>INEGAS / PETROBRAS  |  Ago – Sep 2012</w:t>
-      </w:r>
-    </w:p>
-    <w:p>
-      <w:pPr>
-        <w:spacing w:before="80" w:after="20"/>
-        <w:ind w:left="288"/>
-      </w:pPr>
-      <w:r>
-        <w:rPr>
-          <w:color w:val="2E86AB"/>
-          <w:sz w:val="14"/>
-        </w:rPr>
-        <w:t xml:space="preserve">▪  </w:t>
-      </w:r>
-      <w:r>
-        <w:rPr>
-          <w:rFonts w:ascii="Calibri" w:hAnsi="Calibri"/>
-          <w:b/>
-          <w:color w:val="0F2B46"/>
-          <w:sz w:val="20"/>
-        </w:rPr>
-        <w:t>Técnicas de Optimización y Mejoramiento de Sistemas de Gestión</w:t>
-      </w:r>
-    </w:p>
-    <w:p>
-      <w:pPr>
-        <w:spacing w:before="0" w:after="40"/>
-        <w:ind w:left="576"/>
-      </w:pPr>
-      <w:r>
-        <w:rPr>
-          <w:rFonts w:ascii="Calibri" w:hAnsi="Calibri"/>
-          <w:i/>
-          <w:color w:val="666666"/>
-          <w:sz w:val="18"/>
-        </w:rPr>
-        <w:t>IBNORCA  |  Abril 2012</w:t>
-      </w:r>
-    </w:p>
-    <w:p>
-      <w:pPr>
-        <w:spacing w:before="80" w:after="20"/>
-        <w:ind w:left="288"/>
-      </w:pPr>
-      <w:r>
-        <w:rPr>
-          <w:color w:val="2E86AB"/>
-          <w:sz w:val="14"/>
-        </w:rPr>
-        <w:t xml:space="preserve">▪  </w:t>
-      </w:r>
-      <w:r>
-        <w:rPr>
-          <w:rFonts w:ascii="Calibri" w:hAnsi="Calibri"/>
-          <w:b/>
-          <w:color w:val="0F2B46"/>
-          <w:sz w:val="20"/>
-        </w:rPr>
-        <w:t>Elaboración y Evaluación de Fichas Ambientales</w:t>
-      </w:r>
-    </w:p>
-    <w:p>
-      <w:pPr>
-        <w:spacing w:before="0" w:after="40"/>
-        <w:ind w:left="576"/>
-      </w:pPr>
-      <w:r>
-        <w:rPr>
-          <w:rFonts w:ascii="Calibri" w:hAnsi="Calibri"/>
-          <w:i/>
-          <w:color w:val="666666"/>
-          <w:sz w:val="18"/>
-        </w:rPr>
-        <w:t>UAGRM, Facultad de Ciencias Exactas y Tecnología  |  Marzo 2012</w:t>
-      </w:r>
-    </w:p>
-    <w:p>
-      <w:pPr>
-        <w:spacing w:before="80" w:after="20"/>
-        <w:ind w:left="288"/>
-      </w:pPr>
-      <w:r>
-        <w:rPr>
-          <w:color w:val="2E86AB"/>
-          <w:sz w:val="14"/>
-        </w:rPr>
-        <w:t xml:space="preserve">▪  </w:t>
-      </w:r>
-      <w:r>
-        <w:rPr>
-          <w:rFonts w:ascii="Calibri" w:hAnsi="Calibri"/>
-          <w:b/>
-          <w:color w:val="0F2B46"/>
-          <w:sz w:val="20"/>
-        </w:rPr>
-        <w:t>Parámetros Competitivos del Futuro Profesional</w:t>
-      </w:r>
-    </w:p>
-    <w:p>
-      <w:pPr>
-        <w:spacing w:before="0" w:after="40"/>
-        <w:ind w:left="576"/>
-      </w:pPr>
-      <w:r>
-        <w:rPr>
-          <w:rFonts w:ascii="Calibri" w:hAnsi="Calibri"/>
-          <w:i/>
-          <w:color w:val="666666"/>
-          <w:sz w:val="18"/>
-        </w:rPr>
-        <w:t>Grupo Avanti Manageriale  |  Sep – Oct 2009</w:t>
-      </w:r>
-    </w:p>
-    <w:p>
-      <w:pPr>
-        <w:spacing w:before="80" w:after="20"/>
-        <w:ind w:left="288"/>
-      </w:pPr>
-      <w:r>
-        <w:rPr>
-          <w:color w:val="2E86AB"/>
-          <w:sz w:val="14"/>
-        </w:rPr>
-        <w:t xml:space="preserve">▪  </w:t>
-      </w:r>
-      <w:r>
-        <w:rPr>
-          <w:rFonts w:ascii="Calibri" w:hAnsi="Calibri"/>
-          <w:b/>
-          <w:color w:val="0F2B46"/>
-          <w:sz w:val="20"/>
-        </w:rPr>
-        <w:t>Ley 1333, Reglamentos Ambientales, RPCA e Impactos Ambientales</w:t>
-      </w:r>
-    </w:p>
-    <w:p>
-      <w:pPr>
-        <w:spacing w:before="0" w:after="40"/>
-        <w:ind w:left="576"/>
-      </w:pPr>
-      <w:r>
-        <w:rPr>
-          <w:rFonts w:ascii="Calibri" w:hAnsi="Calibri"/>
-          <w:i/>
-          <w:color w:val="666666"/>
-          <w:sz w:val="18"/>
-        </w:rPr>
-        <w:t>CAPIA-SRZ / UAGRM  |  Sep – Oct 2009</w:t>
-      </w:r>
-    </w:p>
-    <w:p>
-      <w:pPr>
-        <w:spacing w:before="80" w:after="20"/>
-        <w:ind w:left="288"/>
-      </w:pPr>
-      <w:r>
-        <w:rPr>
-          <w:color w:val="2E86AB"/>
-          <w:sz w:val="14"/>
-        </w:rPr>
-        <w:t xml:space="preserve">▪  </w:t>
-      </w:r>
-      <w:r>
-        <w:rPr>
-          <w:rFonts w:ascii="Calibri" w:hAnsi="Calibri"/>
-          <w:b/>
-          <w:color w:val="0F2B46"/>
-          <w:sz w:val="20"/>
-        </w:rPr>
-        <w:t>Teledetección Aplicada a Recursos Naturales</w:t>
-      </w:r>
-    </w:p>
-    <w:p>
-      <w:pPr>
-        <w:spacing w:before="0" w:after="40"/>
-        <w:ind w:left="576"/>
-      </w:pPr>
-      <w:r>
-        <w:rPr>
-          <w:rFonts w:ascii="Calibri" w:hAnsi="Calibri"/>
-          <w:i/>
-          <w:color w:val="666666"/>
-          <w:sz w:val="18"/>
-        </w:rPr>
-        <w:t>UMSA / SELPER – Capítulo Bolivia  |  Febrero 2008</w:t>
-      </w:r>
-    </w:p>
-    <w:p>
-      <w:pPr>
-        <w:spacing w:before="80" w:after="20"/>
-        <w:ind w:left="288"/>
-      </w:pPr>
-      <w:r>
-        <w:rPr>
-          <w:color w:val="2E86AB"/>
-          <w:sz w:val="14"/>
-        </w:rPr>
-        <w:t xml:space="preserve">▪  </w:t>
-      </w:r>
-      <w:r>
-        <w:rPr>
-          <w:rFonts w:ascii="Calibri" w:hAnsi="Calibri"/>
-          <w:b/>
-          <w:color w:val="0F2B46"/>
-          <w:sz w:val="20"/>
-        </w:rPr>
-        <w:t>Procesamiento Digital de Imágenes Satelitales</w:t>
-      </w:r>
-    </w:p>
-    <w:p>
-      <w:pPr>
-        <w:spacing w:before="0" w:after="40"/>
-        <w:ind w:left="576"/>
-      </w:pPr>
-      <w:r>
-        <w:rPr>
-          <w:rFonts w:ascii="Calibri" w:hAnsi="Calibri"/>
-          <w:i/>
-          <w:color w:val="666666"/>
-          <w:sz w:val="18"/>
-        </w:rPr>
-        <w:t>UMSS, Escuela de Ciencias Forestales  |  Marzo 2008</w:t>
-      </w:r>
-    </w:p>
-    <w:p>
-      <w:pPr>
-        <w:spacing w:before="280" w:after="40"/>
-      </w:pPr>
-      <w:r>
-        <w:rPr>
-          <w:rFonts w:ascii="Calibri" w:hAnsi="Calibri"/>
-          <w:b/>
-          <w:color w:val="1B3A5C"/>
-          <w:sz w:val="24"/>
-          <w:spacing w:val="40"/>
-        </w:rPr>
-        <w:t>PARTICIPACIÓN EN CONGRESOS Y EVENTOS TÉCNICOS</w:t>
-      </w:r>
-    </w:p>
-    <w:p>
-      <w:pPr>
-        <w:spacing w:before="40" w:after="120"/>
-        <w:pBdr>
-          <w:bottom w:val="single" w:sz="4" w:space="1" w:color="1B3A5C"/>
-        </w:pBdr>
-      </w:pPr>
-    </w:p>
-    <w:p>
-      <w:pPr>
-        <w:spacing w:before="40" w:after="20"/>
-        <w:ind w:left="288"/>
-      </w:pPr>
-      <w:r>
-        <w:rPr>
-          <w:color w:val="2E86AB"/>
-          <w:sz w:val="14"/>
-        </w:rPr>
-        <w:t xml:space="preserve">▪  </w:t>
-      </w:r>
-      <w:r>
-        <w:rPr>
-          <w:rFonts w:ascii="Calibri" w:hAnsi="Calibri"/>
-          <w:color w:val="333333"/>
-          <w:sz w:val="19"/>
-        </w:rPr>
-        <w:t>X Congreso Nacional de Estudiantes de Ing. Química, Alimentos y Ambiental – UAJMS, Tarija (2011)</w:t>
-      </w:r>
-    </w:p>
-    <w:p>
-      <w:pPr>
-        <w:spacing w:before="40" w:after="20"/>
-        <w:ind w:left="288"/>
-      </w:pPr>
-      <w:r>
-        <w:rPr>
-          <w:color w:val="2E86AB"/>
-          <w:sz w:val="14"/>
-        </w:rPr>
-        <w:t xml:space="preserve">▪  </w:t>
-      </w:r>
-      <w:r>
-        <w:rPr>
-          <w:rFonts w:ascii="Calibri" w:hAnsi="Calibri"/>
-          <w:color w:val="333333"/>
-          <w:sz w:val="19"/>
-        </w:rPr>
-        <w:t>IX Congreso Nacional de Estudiantes de Ing. Química, Alimentos y Ambiental – UATF, Potosí (2010)</w:t>
-      </w:r>
-    </w:p>
-    <w:p>
-      <w:pPr>
-        <w:spacing w:before="40" w:after="20"/>
-        <w:ind w:left="288"/>
-      </w:pPr>
-      <w:r>
-        <w:rPr>
-          <w:color w:val="2E86AB"/>
-          <w:sz w:val="14"/>
-        </w:rPr>
-        <w:t xml:space="preserve">▪  </w:t>
-      </w:r>
-      <w:r>
-        <w:rPr>
-          <w:rFonts w:ascii="Calibri" w:hAnsi="Calibri"/>
-          <w:color w:val="333333"/>
-          <w:sz w:val="19"/>
-        </w:rPr>
-        <w:t>Colaboración como capacitador ambiental en el programa "Aprender a Emprender en el Medio Ambiente" – EMACRUZ / Junior Achievement (2010)</w:t>
-      </w:r>
-    </w:p>
-    <w:p>
-      <w:pPr>
-        <w:spacing w:before="40" w:after="20"/>
-        <w:ind w:left="288"/>
-      </w:pPr>
-      <w:r>
-        <w:rPr>
-          <w:color w:val="2E86AB"/>
-          <w:sz w:val="14"/>
-        </w:rPr>
-        <w:t xml:space="preserve">▪  </w:t>
-      </w:r>
-      <w:r>
-        <w:rPr>
-          <w:rFonts w:ascii="Calibri" w:hAnsi="Calibri"/>
-          <w:color w:val="333333"/>
-          <w:sz w:val="19"/>
-        </w:rPr>
-        <w:t>Conferencia: Explotación Antrópica de las Riberas del Río Piraí – SEARPI / UAGRM (2011)</w:t>
-      </w:r>
-    </w:p>
-    <w:p>
-      <w:pPr>
-        <w:spacing w:before="40" w:after="20"/>
-        <w:ind w:left="288"/>
-      </w:pPr>
-      <w:r>
-        <w:rPr>
-          <w:color w:val="2E86AB"/>
-          <w:sz w:val="14"/>
-        </w:rPr>
-        <w:t xml:space="preserve">▪  </w:t>
-      </w:r>
-      <w:r>
-        <w:rPr>
-          <w:rFonts w:ascii="Calibri" w:hAnsi="Calibri"/>
-          <w:color w:val="333333"/>
-          <w:sz w:val="19"/>
-        </w:rPr>
-        <w:t>Conferencia: Control de Derrame de Hidrocarburos – UAGRM (2010)</w:t>
-      </w:r>
-    </w:p>
-    <w:p>
-      <w:pPr>
-        <w:spacing w:before="40" w:after="20"/>
-        <w:ind w:left="288"/>
-      </w:pPr>
-      <w:r>
-        <w:rPr>
-          <w:color w:val="2E86AB"/>
-          <w:sz w:val="14"/>
-        </w:rPr>
-        <w:t xml:space="preserve">▪  </w:t>
-      </w:r>
-      <w:r>
-        <w:rPr>
-          <w:rFonts w:ascii="Calibri" w:hAnsi="Calibri"/>
-          <w:color w:val="333333"/>
-          <w:sz w:val="19"/>
-        </w:rPr>
-        <w:t>Conferencia: Análisis Laboratorial de Potabilidad y Tratamiento de Aguas – UAGRM (2010)</w:t>
-      </w:r>
-    </w:p>
-    <w:p>
-      <w:pPr>
-        <w:spacing w:before="40" w:after="20"/>
-        <w:ind w:left="288"/>
-      </w:pPr>
-      <w:r>
-        <w:rPr>
-          <w:color w:val="2E86AB"/>
-          <w:sz w:val="14"/>
-        </w:rPr>
-        <w:t xml:space="preserve">▪  </w:t>
-      </w:r>
-      <w:r>
-        <w:rPr>
-          <w:rFonts w:ascii="Calibri" w:hAnsi="Calibri"/>
-          <w:color w:val="333333"/>
-          <w:sz w:val="19"/>
-        </w:rPr>
-        <w:t>Curso: Diseño de Vertederos – UAGRM (2010)</w:t>
-      </w:r>
-    </w:p>
-    <w:p>
-      <w:pPr>
-        <w:spacing w:before="40" w:after="20"/>
-        <w:ind w:left="288"/>
-      </w:pPr>
-      <w:r>
-        <w:rPr>
-          <w:color w:val="2E86AB"/>
-          <w:sz w:val="14"/>
-        </w:rPr>
-        <w:t xml:space="preserve">▪  </w:t>
-      </w:r>
-      <w:r>
-        <w:rPr>
-          <w:rFonts w:ascii="Calibri" w:hAnsi="Calibri"/>
-          <w:color w:val="333333"/>
-          <w:sz w:val="19"/>
-        </w:rPr>
-        <w:t>Conferencia: Problemática Ambiental del Manejo de Residuos Sólidos Peligrosos – Hydrokyber Group (2009)</w:t>
-      </w:r>
-    </w:p>
-    <w:p>
-      <w:pPr>
-        <w:spacing w:before="280" w:after="40"/>
-      </w:pPr>
-      <w:r>
-        <w:rPr>
-          <w:rFonts w:ascii="Calibri" w:hAnsi="Calibri"/>
-          <w:b/>
-          <w:color w:val="1B3A5C"/>
-          <w:sz w:val="24"/>
-          <w:spacing w:val="40"/>
-        </w:rPr>
-        <w:t>COMPETENCIAS TÉCNICAS</w:t>
-      </w:r>
-    </w:p>
-    <w:p>
-      <w:pPr>
-        <w:spacing w:before="40" w:after="120"/>
-        <w:pBdr>
-          <w:bottom w:val="single" w:sz="4" w:space="1" w:color="1B3A5C"/>
-        </w:pBdr>
-      </w:pPr>
-    </w:p>
-    <w:tbl>
-      <w:tblPr>
-        <w:tblW w:type="auto" w:w="0"/>
-        <w:jc w:val="center"/>
         <w:tblLook w:firstColumn="1" w:firstRow="1" w:lastColumn="0" w:lastRow="0" w:noHBand="0" w:noVBand="1" w:val="04A0"/>
         <w:tblW w:type="pct" w:w="5000"/>
         <w:tblBorders>
@@ -2139,59 +82,756 @@
         </w:tblBorders>
       </w:tblPr>
       <w:tblGrid>
-        <w:gridCol w:w="4986"/>
-        <w:gridCol w:w="4986"/>
+        <w:gridCol w:w="10200"/>
       </w:tblGrid>
       <w:tr>
         <w:tc>
           <w:tcPr>
-            <w:tcW w:type="dxa" w:w="4986"/>
+            <w:tcW w:type="dxa" w:w="10200"/>
+            <w:shd w:fill="F5F7FA" w:val="clear"/>
+            <w:tcMar>
+              <w:top w:w="60" w:type="dxa"/>
+              <w:left w:w="100" w:type="dxa"/>
+              <w:bottom w:w="60" w:type="dxa"/>
+              <w:right w:w="100" w:type="dxa"/>
+            </w:tcMar>
           </w:tcPr>
           <w:p>
             <w:pPr>
-              <w:spacing w:before="40" w:after="40"/>
+              <w:jc w:val="center"/>
             </w:pPr>
             <w:r>
               <w:rPr>
                 <w:rFonts w:ascii="Calibri" w:hAnsi="Calibri"/>
+                <w:b w:val="0"/>
+                <w:i w:val="0"/>
                 <w:color w:val="2E86AB"/>
-                <w:sz w:val="14"/>
+                <w:sz w:val="17"/>
               </w:rPr>
-              <w:t xml:space="preserve">▪ </w:t>
+              <w:t xml:space="preserve">☎ </w:t>
             </w:r>
             <w:r>
               <w:rPr>
                 <w:rFonts w:ascii="Calibri" w:hAnsi="Calibri"/>
-                <w:color w:val="333333"/>
-                <w:sz w:val="20"/>
+                <w:b w:val="0"/>
+                <w:i w:val="0"/>
+                <w:color w:val="2D2D2D"/>
+                <w:sz w:val="17"/>
               </w:rPr>
-              <w:t xml:space="preserve"> Fiscalización y Control Regulatorio</w:t>
+              <w:t>708-79425 / 687-51323</w:t>
+            </w:r>
+            <w:r>
+              <w:rPr>
+                <w:rFonts w:ascii="Calibri" w:hAnsi="Calibri"/>
+                <w:b w:val="0"/>
+                <w:i w:val="0"/>
+                <w:color w:val="2E86AB"/>
+                <w:sz w:val="17"/>
+              </w:rPr>
+              <w:t xml:space="preserve">    ✉ </w:t>
+            </w:r>
+            <w:r>
+              <w:rPr>
+                <w:rFonts w:ascii="Calibri" w:hAnsi="Calibri"/>
+                <w:b w:val="0"/>
+                <w:i w:val="0"/>
+                <w:color w:val="2D2D2D"/>
+                <w:sz w:val="17"/>
+              </w:rPr>
+              <w:t>carlos.xco@gmail.com</w:t>
+            </w:r>
+            <w:r>
+              <w:rPr>
+                <w:rFonts w:ascii="Calibri" w:hAnsi="Calibri"/>
+                <w:b w:val="0"/>
+                <w:i w:val="0"/>
+                <w:color w:val="2E86AB"/>
+                <w:sz w:val="17"/>
+              </w:rPr>
+              <w:t xml:space="preserve">    ⌂ </w:t>
+            </w:r>
+            <w:r>
+              <w:rPr>
+                <w:rFonts w:ascii="Calibri" w:hAnsi="Calibri"/>
+                <w:b w:val="0"/>
+                <w:i w:val="0"/>
+                <w:color w:val="2D2D2D"/>
+                <w:sz w:val="17"/>
+              </w:rPr>
+              <w:t>Santa Cruz, Bolivia</w:t>
+            </w:r>
+            <w:r>
+              <w:rPr>
+                <w:rFonts w:ascii="Calibri" w:hAnsi="Calibri"/>
+                <w:b w:val="0"/>
+                <w:i w:val="0"/>
+                <w:color w:val="2E86AB"/>
+                <w:sz w:val="17"/>
+              </w:rPr>
+              <w:t xml:space="preserve">    CI: </w:t>
+            </w:r>
+            <w:r>
+              <w:rPr>
+                <w:rFonts w:ascii="Calibri" w:hAnsi="Calibri"/>
+                <w:b w:val="0"/>
+                <w:i w:val="0"/>
+                <w:color w:val="2D2D2D"/>
+                <w:sz w:val="17"/>
+              </w:rPr>
+              <w:t>6254418 SC</w:t>
+            </w:r>
+          </w:p>
+        </w:tc>
+      </w:tr>
+    </w:tbl>
+    <w:p>
+      <w:pPr>
+        <w:spacing w:before="200" w:after="0"/>
+        <w:pBdr>
+          <w:bottom w:val="single" w:sz="6" w:space="1" w:color="1B3A5C"/>
+        </w:pBdr>
+      </w:pPr>
+      <w:r>
+        <w:rPr>
+          <w:rFonts w:ascii="Calibri" w:hAnsi="Calibri"/>
+          <w:b/>
+          <w:color w:val="1B3A5C"/>
+          <w:sz w:val="21"/>
+          <w:spacing w:val="50"/>
+        </w:rPr>
+        <w:t>PERFIL PROFESIONAL</w:t>
+      </w:r>
+    </w:p>
+    <w:p>
+      <w:pPr>
+        <w:spacing w:before="80" w:after="40"/>
+        <w:jc w:val="both"/>
+      </w:pPr>
+      <w:r>
+        <w:rPr>
+          <w:rFonts w:ascii="Calibri" w:hAnsi="Calibri"/>
+          <w:b w:val="0"/>
+          <w:i w:val="0"/>
+          <w:color w:val="2D2D2D"/>
+          <w:sz w:val="18"/>
+        </w:rPr>
+        <w:t>Ingeniero Ambiental con +12 años de experiencia en el sector público y privado. Trayectoria ascendente en entidades reguladoras del Estado, desde nivel técnico hasta Dirección de Distritos. Especializado en fiscalización, control de riesgos, inspección técnica y gestión QHSE. Diplomado en Diseño de Plantas de Tratamiento de Residuos y Especialista OHSAS 18001.</w:t>
+      </w:r>
+    </w:p>
+    <w:p>
+      <w:pPr>
+        <w:spacing w:before="200" w:after="0"/>
+        <w:pBdr>
+          <w:bottom w:val="single" w:sz="6" w:space="1" w:color="1B3A5C"/>
+        </w:pBdr>
+      </w:pPr>
+      <w:r>
+        <w:rPr>
+          <w:rFonts w:ascii="Calibri" w:hAnsi="Calibri"/>
+          <w:b/>
+          <w:color w:val="1B3A5C"/>
+          <w:sz w:val="21"/>
+          <w:spacing w:val="50"/>
+        </w:rPr>
+        <w:t>EXPERIENCIA PROFESIONAL</w:t>
+      </w:r>
+    </w:p>
+    <w:p>
+      <w:pPr>
+        <w:spacing w:before="120" w:after="20"/>
+      </w:pPr>
+      <w:r>
+        <w:rPr>
+          <w:rFonts w:ascii="Calibri" w:hAnsi="Calibri"/>
+          <w:b/>
+          <w:i w:val="0"/>
+          <w:color w:val="1B3A5C"/>
+          <w:sz w:val="20"/>
+        </w:rPr>
+        <w:t>ENTIDAD REGULADORA DEL SECTOR ENERGÉTICO</w:t>
+      </w:r>
+      <w:r>
+        <w:rPr>
+          <w:rFonts w:ascii="Calibri" w:hAnsi="Calibri"/>
+          <w:b w:val="0"/>
+          <w:i/>
+          <w:color w:val="666666"/>
+          <w:sz w:val="17"/>
+        </w:rPr>
+        <w:t xml:space="preserve">   Santa Cruz, Bolivia  |  2014 – Presente</w:t>
+      </w:r>
+    </w:p>
+    <w:p>
+      <w:pPr>
+        <w:spacing w:before="100" w:after="20"/>
+        <w:ind w:left="216"/>
+      </w:pPr>
+      <w:r>
+        <w:rPr>
+          <w:rFonts w:ascii="Calibri" w:hAnsi="Calibri"/>
+          <w:b w:val="0"/>
+          <w:i w:val="0"/>
+          <w:color w:val="2E86AB"/>
+          <w:sz w:val="16"/>
+        </w:rPr>
+        <w:t xml:space="preserve">▸ </w:t>
+      </w:r>
+      <w:r>
+        <w:rPr>
+          <w:rFonts w:ascii="Calibri" w:hAnsi="Calibri"/>
+          <w:b/>
+          <w:i w:val="0"/>
+          <w:color w:val="0F2B46"/>
+          <w:sz w:val="19"/>
+        </w:rPr>
+        <w:t>Director de Distritos Técnica</w:t>
+      </w:r>
+      <w:r>
+        <w:rPr>
+          <w:rFonts w:ascii="Calibri" w:hAnsi="Calibri"/>
+          <w:b w:val="0"/>
+          <w:i w:val="0"/>
+          <w:color w:val="666666"/>
+          <w:sz w:val="17"/>
+        </w:rPr>
+        <w:t xml:space="preserve">  (Oct 2023 – May 2025)</w:t>
+      </w:r>
+    </w:p>
+    <w:p>
+      <w:pPr>
+        <w:spacing w:before="10" w:after="10"/>
+        <w:ind w:left="504" w:hanging="216"/>
+      </w:pPr>
+      <w:r>
+        <w:rPr>
+          <w:rFonts w:ascii="Calibri" w:hAnsi="Calibri"/>
+          <w:b w:val="0"/>
+          <w:i w:val="0"/>
+          <w:color w:val="2E86AB"/>
+          <w:sz w:val="12"/>
+        </w:rPr>
+        <w:t xml:space="preserve">▪ </w:t>
+      </w:r>
+      <w:r>
+        <w:rPr>
+          <w:rFonts w:ascii="Calibri" w:hAnsi="Calibri"/>
+          <w:b w:val="0"/>
+          <w:i w:val="0"/>
+          <w:color w:val="2D2D2D"/>
+          <w:sz w:val="18"/>
+        </w:rPr>
+        <w:t>Dirección integral de operaciones de los distritos técnicos a nivel departamental.</w:t>
+      </w:r>
+    </w:p>
+    <w:p>
+      <w:pPr>
+        <w:spacing w:before="10" w:after="10"/>
+        <w:ind w:left="504" w:hanging="216"/>
+      </w:pPr>
+      <w:r>
+        <w:rPr>
+          <w:rFonts w:ascii="Calibri" w:hAnsi="Calibri"/>
+          <w:b w:val="0"/>
+          <w:i w:val="0"/>
+          <w:color w:val="2E86AB"/>
+          <w:sz w:val="12"/>
+        </w:rPr>
+        <w:t xml:space="preserve">▪ </w:t>
+      </w:r>
+      <w:r>
+        <w:rPr>
+          <w:rFonts w:ascii="Calibri" w:hAnsi="Calibri"/>
+          <w:b w:val="0"/>
+          <w:i w:val="0"/>
+          <w:color w:val="2D2D2D"/>
+          <w:sz w:val="18"/>
+        </w:rPr>
+        <w:t>Supervisión del cumplimiento normativo de operadores regulados y liderazgo de equipos multidisciplinarios.</w:t>
+      </w:r>
+    </w:p>
+    <w:p>
+      <w:pPr>
+        <w:spacing w:before="10" w:after="10"/>
+        <w:ind w:left="504" w:hanging="216"/>
+      </w:pPr>
+      <w:r>
+        <w:rPr>
+          <w:rFonts w:ascii="Calibri" w:hAnsi="Calibri"/>
+          <w:b w:val="0"/>
+          <w:i w:val="0"/>
+          <w:color w:val="2E86AB"/>
+          <w:sz w:val="12"/>
+        </w:rPr>
+        <w:t xml:space="preserve">▪ </w:t>
+      </w:r>
+      <w:r>
+        <w:rPr>
+          <w:rFonts w:ascii="Calibri" w:hAnsi="Calibri"/>
+          <w:b w:val="0"/>
+          <w:i w:val="0"/>
+          <w:color w:val="2D2D2D"/>
+          <w:sz w:val="18"/>
+        </w:rPr>
+        <w:t>Planificación estratégica de actividades de fiscalización e inspección.</w:t>
+      </w:r>
+    </w:p>
+    <w:p>
+      <w:pPr>
+        <w:spacing w:before="100" w:after="20"/>
+        <w:ind w:left="216"/>
+      </w:pPr>
+      <w:r>
+        <w:rPr>
+          <w:rFonts w:ascii="Calibri" w:hAnsi="Calibri"/>
+          <w:b w:val="0"/>
+          <w:i w:val="0"/>
+          <w:color w:val="2E86AB"/>
+          <w:sz w:val="16"/>
+        </w:rPr>
+        <w:t xml:space="preserve">▸ </w:t>
+      </w:r>
+      <w:r>
+        <w:rPr>
+          <w:rFonts w:ascii="Calibri" w:hAnsi="Calibri"/>
+          <w:b/>
+          <w:i w:val="0"/>
+          <w:color w:val="0F2B46"/>
+          <w:sz w:val="19"/>
+        </w:rPr>
+        <w:t>Jefe de Unidad de Control, Supervisión de Riesgos y Contabilidad de Negocio</w:t>
+      </w:r>
+      <w:r>
+        <w:rPr>
+          <w:rFonts w:ascii="Calibri" w:hAnsi="Calibri"/>
+          <w:b w:val="0"/>
+          <w:i w:val="0"/>
+          <w:color w:val="666666"/>
+          <w:sz w:val="17"/>
+        </w:rPr>
+        <w:t xml:space="preserve">  (May 2021 – Oct 2023)</w:t>
+      </w:r>
+    </w:p>
+    <w:p>
+      <w:pPr>
+        <w:spacing w:before="10" w:after="10"/>
+        <w:ind w:left="504" w:hanging="216"/>
+      </w:pPr>
+      <w:r>
+        <w:rPr>
+          <w:rFonts w:ascii="Calibri" w:hAnsi="Calibri"/>
+          <w:b w:val="0"/>
+          <w:i w:val="0"/>
+          <w:color w:val="2E86AB"/>
+          <w:sz w:val="12"/>
+        </w:rPr>
+        <w:t xml:space="preserve">▪ </w:t>
+      </w:r>
+      <w:r>
+        <w:rPr>
+          <w:rFonts w:ascii="Calibri" w:hAnsi="Calibri"/>
+          <w:b w:val="0"/>
+          <w:i w:val="0"/>
+          <w:color w:val="2D2D2D"/>
+          <w:sz w:val="18"/>
+        </w:rPr>
+        <w:t>Liderazgo de la unidad de control y supervisión de riesgos del sector regulado.</w:t>
+      </w:r>
+    </w:p>
+    <w:p>
+      <w:pPr>
+        <w:spacing w:before="10" w:after="10"/>
+        <w:ind w:left="504" w:hanging="216"/>
+      </w:pPr>
+      <w:r>
+        <w:rPr>
+          <w:rFonts w:ascii="Calibri" w:hAnsi="Calibri"/>
+          <w:b w:val="0"/>
+          <w:i w:val="0"/>
+          <w:color w:val="2E86AB"/>
+          <w:sz w:val="12"/>
+        </w:rPr>
+        <w:t xml:space="preserve">▪ </w:t>
+      </w:r>
+      <w:r>
+        <w:rPr>
+          <w:rFonts w:ascii="Calibri" w:hAnsi="Calibri"/>
+          <w:b w:val="0"/>
+          <w:i w:val="0"/>
+          <w:color w:val="2D2D2D"/>
+          <w:sz w:val="18"/>
+        </w:rPr>
+        <w:t>Implementación de sistemas de gestión de riesgos y elaboración de reportes gerenciales.</w:t>
+      </w:r>
+    </w:p>
+    <w:p>
+      <w:pPr>
+        <w:spacing w:before="100" w:after="20"/>
+        <w:ind w:left="216"/>
+      </w:pPr>
+      <w:r>
+        <w:rPr>
+          <w:rFonts w:ascii="Calibri" w:hAnsi="Calibri"/>
+          <w:b w:val="0"/>
+          <w:i w:val="0"/>
+          <w:color w:val="2E86AB"/>
+          <w:sz w:val="16"/>
+        </w:rPr>
+        <w:t xml:space="preserve">▸ </w:t>
+      </w:r>
+      <w:r>
+        <w:rPr>
+          <w:rFonts w:ascii="Calibri" w:hAnsi="Calibri"/>
+          <w:b/>
+          <w:i w:val="0"/>
+          <w:color w:val="0F2B46"/>
+          <w:sz w:val="19"/>
+        </w:rPr>
+        <w:t>Jefe de Unidad de Operación y Participación Energética</w:t>
+      </w:r>
+      <w:r>
+        <w:rPr>
+          <w:rFonts w:ascii="Calibri" w:hAnsi="Calibri"/>
+          <w:b w:val="0"/>
+          <w:i w:val="0"/>
+          <w:color w:val="666666"/>
+          <w:sz w:val="17"/>
+        </w:rPr>
+        <w:t xml:space="preserve">  (Feb – May 2021)</w:t>
+      </w:r>
+    </w:p>
+    <w:p>
+      <w:pPr>
+        <w:spacing w:before="10" w:after="10"/>
+        <w:ind w:left="504" w:hanging="216"/>
+      </w:pPr>
+      <w:r>
+        <w:rPr>
+          <w:rFonts w:ascii="Calibri" w:hAnsi="Calibri"/>
+          <w:b w:val="0"/>
+          <w:i w:val="0"/>
+          <w:color w:val="2E86AB"/>
+          <w:sz w:val="12"/>
+        </w:rPr>
+        <w:t xml:space="preserve">▪ </w:t>
+      </w:r>
+      <w:r>
+        <w:rPr>
+          <w:rFonts w:ascii="Calibri" w:hAnsi="Calibri"/>
+          <w:b w:val="0"/>
+          <w:i w:val="0"/>
+          <w:color w:val="2D2D2D"/>
+          <w:sz w:val="18"/>
+        </w:rPr>
+        <w:t>Coordinación de operaciones de participación energética departamental.</w:t>
+      </w:r>
+    </w:p>
+    <w:p>
+      <w:pPr>
+        <w:spacing w:before="100" w:after="20"/>
+        <w:ind w:left="216"/>
+      </w:pPr>
+      <w:r>
+        <w:rPr>
+          <w:rFonts w:ascii="Calibri" w:hAnsi="Calibri"/>
+          <w:b w:val="0"/>
+          <w:i w:val="0"/>
+          <w:color w:val="2E86AB"/>
+          <w:sz w:val="16"/>
+        </w:rPr>
+        <w:t xml:space="preserve">▸ </w:t>
+      </w:r>
+      <w:r>
+        <w:rPr>
+          <w:rFonts w:ascii="Calibri" w:hAnsi="Calibri"/>
+          <w:b/>
+          <w:i w:val="0"/>
+          <w:color w:val="0F2B46"/>
+          <w:sz w:val="19"/>
+        </w:rPr>
+        <w:t>Profesional de Operaciones / Responsable del Área Técnica</w:t>
+      </w:r>
+      <w:r>
+        <w:rPr>
+          <w:rFonts w:ascii="Calibri" w:hAnsi="Calibri"/>
+          <w:b w:val="0"/>
+          <w:i w:val="0"/>
+          <w:color w:val="666666"/>
+          <w:sz w:val="17"/>
+        </w:rPr>
+        <w:t xml:space="preserve">  (Jun 2018 – Ene 2021)</w:t>
+      </w:r>
+    </w:p>
+    <w:p>
+      <w:pPr>
+        <w:spacing w:before="10" w:after="10"/>
+        <w:ind w:left="504" w:hanging="216"/>
+      </w:pPr>
+      <w:r>
+        <w:rPr>
+          <w:rFonts w:ascii="Calibri" w:hAnsi="Calibri"/>
+          <w:b w:val="0"/>
+          <w:i w:val="0"/>
+          <w:color w:val="2E86AB"/>
+          <w:sz w:val="12"/>
+        </w:rPr>
+        <w:t xml:space="preserve">▪ </w:t>
+      </w:r>
+      <w:r>
+        <w:rPr>
+          <w:rFonts w:ascii="Calibri" w:hAnsi="Calibri"/>
+          <w:b w:val="0"/>
+          <w:i w:val="0"/>
+          <w:color w:val="2D2D2D"/>
+          <w:sz w:val="18"/>
+        </w:rPr>
+        <w:t>Designación como Responsable del Área Técnica del distrito (2020). Gestión de operaciones en las direcciones Distrital y de Comercialización.</w:t>
+      </w:r>
+    </w:p>
+    <w:p>
+      <w:pPr>
+        <w:spacing w:before="100" w:after="20"/>
+        <w:ind w:left="216"/>
+      </w:pPr>
+      <w:r>
+        <w:rPr>
+          <w:rFonts w:ascii="Calibri" w:hAnsi="Calibri"/>
+          <w:b w:val="0"/>
+          <w:i w:val="0"/>
+          <w:color w:val="2E86AB"/>
+          <w:sz w:val="16"/>
+        </w:rPr>
+        <w:t xml:space="preserve">▸ </w:t>
+      </w:r>
+      <w:r>
+        <w:rPr>
+          <w:rFonts w:ascii="Calibri" w:hAnsi="Calibri"/>
+          <w:b/>
+          <w:i w:val="0"/>
+          <w:color w:val="0F2B46"/>
+          <w:sz w:val="19"/>
+        </w:rPr>
+        <w:t>Profesional de Inspecciones</w:t>
+      </w:r>
+      <w:r>
+        <w:rPr>
+          <w:rFonts w:ascii="Calibri" w:hAnsi="Calibri"/>
+          <w:b w:val="0"/>
+          <w:i w:val="0"/>
+          <w:color w:val="666666"/>
+          <w:sz w:val="17"/>
+        </w:rPr>
+        <w:t xml:space="preserve">  (2016 – Jun 2018)</w:t>
+      </w:r>
+    </w:p>
+    <w:p>
+      <w:pPr>
+        <w:spacing w:before="10" w:after="10"/>
+        <w:ind w:left="504" w:hanging="216"/>
+      </w:pPr>
+      <w:r>
+        <w:rPr>
+          <w:rFonts w:ascii="Calibri" w:hAnsi="Calibri"/>
+          <w:b w:val="0"/>
+          <w:i w:val="0"/>
+          <w:color w:val="2E86AB"/>
+          <w:sz w:val="12"/>
+        </w:rPr>
+        <w:t xml:space="preserve">▪ </w:t>
+      </w:r>
+      <w:r>
+        <w:rPr>
+          <w:rFonts w:ascii="Calibri" w:hAnsi="Calibri"/>
+          <w:b w:val="0"/>
+          <w:i w:val="0"/>
+          <w:color w:val="2D2D2D"/>
+          <w:sz w:val="18"/>
+        </w:rPr>
+        <w:t>Inspecciones técnicas, informes de fiscalización y verificación in situ del cumplimiento normativo.</w:t>
+      </w:r>
+    </w:p>
+    <w:p>
+      <w:pPr>
+        <w:spacing w:before="100" w:after="20"/>
+        <w:ind w:left="216"/>
+      </w:pPr>
+      <w:r>
+        <w:rPr>
+          <w:rFonts w:ascii="Calibri" w:hAnsi="Calibri"/>
+          <w:b w:val="0"/>
+          <w:i w:val="0"/>
+          <w:color w:val="2E86AB"/>
+          <w:sz w:val="16"/>
+        </w:rPr>
+        <w:t xml:space="preserve">▸ </w:t>
+      </w:r>
+      <w:r>
+        <w:rPr>
+          <w:rFonts w:ascii="Calibri" w:hAnsi="Calibri"/>
+          <w:b/>
+          <w:i w:val="0"/>
+          <w:color w:val="0F2B46"/>
+          <w:sz w:val="19"/>
+        </w:rPr>
+        <w:t>Asistente / Auxiliar de Inspecciones</w:t>
+      </w:r>
+      <w:r>
+        <w:rPr>
+          <w:rFonts w:ascii="Calibri" w:hAnsi="Calibri"/>
+          <w:b w:val="0"/>
+          <w:i w:val="0"/>
+          <w:color w:val="666666"/>
+          <w:sz w:val="17"/>
+        </w:rPr>
+        <w:t xml:space="preserve">  (2014 – 2016)</w:t>
+      </w:r>
+    </w:p>
+    <w:p>
+      <w:pPr>
+        <w:spacing w:before="10" w:after="10"/>
+        <w:ind w:left="504" w:hanging="216"/>
+      </w:pPr>
+      <w:r>
+        <w:rPr>
+          <w:rFonts w:ascii="Calibri" w:hAnsi="Calibri"/>
+          <w:b w:val="0"/>
+          <w:i w:val="0"/>
+          <w:color w:val="2E86AB"/>
+          <w:sz w:val="12"/>
+        </w:rPr>
+        <w:t xml:space="preserve">▪ </w:t>
+      </w:r>
+      <w:r>
+        <w:rPr>
+          <w:rFonts w:ascii="Calibri" w:hAnsi="Calibri"/>
+          <w:b w:val="0"/>
+          <w:i w:val="0"/>
+          <w:color w:val="2D2D2D"/>
+          <w:sz w:val="18"/>
+        </w:rPr>
+        <w:t>Apoyo técnico en procesos de inspección, fiscalización y sistematización de información.</w:t>
+      </w:r>
+    </w:p>
+    <w:p>
+      <w:pPr>
+        <w:spacing w:before="80" w:after="20"/>
+        <w:ind w:left="216"/>
+      </w:pPr>
+      <w:r>
+        <w:rPr>
+          <w:rFonts w:ascii="Calibri" w:hAnsi="Calibri"/>
+          <w:b w:val="0"/>
+          <w:i w:val="0"/>
+          <w:color w:val="2E86AB"/>
+          <w:sz w:val="16"/>
+        </w:rPr>
+        <w:t xml:space="preserve">▸ </w:t>
+      </w:r>
+      <w:r>
+        <w:rPr>
+          <w:rFonts w:ascii="Calibri" w:hAnsi="Calibri"/>
+          <w:b/>
+          <w:i w:val="0"/>
+          <w:color w:val="0F2B46"/>
+          <w:sz w:val="19"/>
+        </w:rPr>
+        <w:t>Técnico en Operaciones – Dirección Distrital Santa Cruz</w:t>
+      </w:r>
+      <w:r>
+        <w:rPr>
+          <w:rFonts w:ascii="Calibri" w:hAnsi="Calibri"/>
+          <w:b w:val="0"/>
+          <w:i w:val="0"/>
+          <w:color w:val="666666"/>
+          <w:sz w:val="17"/>
+        </w:rPr>
+        <w:t xml:space="preserve">  (May 2025 – Presente)</w:t>
+      </w:r>
+    </w:p>
+    <w:p>
+      <w:pPr>
+        <w:spacing w:before="100" w:after="20"/>
+        <w:pBdr>
+          <w:bottom w:val="dotted" w:sz="4" w:space="1" w:color="2E86AB"/>
+        </w:pBdr>
+      </w:pPr>
+    </w:p>
+    <w:tbl>
+      <w:tblPr>
+        <w:tblW w:type="auto" w:w="0"/>
+        <w:tblLook w:firstColumn="1" w:firstRow="1" w:lastColumn="0" w:lastRow="0" w:noHBand="0" w:noVBand="1" w:val="04A0"/>
+        <w:tblW w:type="pct" w:w="5000"/>
+        <w:tblBorders>
+          <w:top w:val="none" w:sz="0" w:space="0" w:color="auto"/>
+          <w:left w:val="none" w:sz="0" w:space="0" w:color="auto"/>
+          <w:bottom w:val="none" w:sz="0" w:space="0" w:color="auto"/>
+          <w:right w:val="none" w:sz="0" w:space="0" w:color="auto"/>
+          <w:insideH w:val="none" w:sz="0" w:space="0" w:color="auto"/>
+          <w:insideV w:val="none" w:sz="0" w:space="0" w:color="auto"/>
+        </w:tblBorders>
+      </w:tblPr>
+      <w:tblGrid>
+        <w:gridCol w:w="3400"/>
+        <w:gridCol w:w="3400"/>
+        <w:gridCol w:w="3400"/>
+      </w:tblGrid>
+      <w:tr>
+        <w:tc>
+          <w:tcPr>
+            <w:tcW w:type="dxa" w:w="1701"/>
+          </w:tcPr>
+          <w:p>
+            <w:pPr>
+              <w:spacing w:before="60" w:after="20"/>
+            </w:pPr>
+            <w:r>
+              <w:rPr>
+                <w:rFonts w:ascii="Calibri" w:hAnsi="Calibri"/>
+                <w:b/>
+                <w:i w:val="0"/>
+                <w:color w:val="2E86AB"/>
+                <w:sz w:val="16"/>
+              </w:rPr>
+              <w:t>Ene – Mar 2014</w:t>
             </w:r>
           </w:p>
         </w:tc>
         <w:tc>
           <w:tcPr>
-            <w:tcW w:type="dxa" w:w="4986"/>
+            <w:tcW w:type="dxa" w:w="2551"/>
           </w:tcPr>
           <w:p>
             <w:pPr>
-              <w:spacing w:before="40" w:after="40"/>
+              <w:spacing w:before="60" w:after="20"/>
             </w:pPr>
             <w:r>
               <w:rPr>
                 <w:rFonts w:ascii="Calibri" w:hAnsi="Calibri"/>
-                <w:color w:val="2E86AB"/>
-                <w:sz w:val="14"/>
+                <w:b/>
+                <w:i w:val="0"/>
+                <w:color w:val="0F2B46"/>
+                <w:sz w:val="18"/>
               </w:rPr>
-              <w:t xml:space="preserve">▪ </w:t>
+              <w:t>Técnico II</w:t>
             </w:r>
+          </w:p>
+        </w:tc>
+        <w:tc>
+          <w:tcPr>
+            <w:tcW w:type="dxa" w:w="5669"/>
+          </w:tcPr>
+          <w:p>
+            <w:pPr>
+              <w:spacing w:before="60" w:after="20"/>
+            </w:pPr>
             <w:r>
               <w:rPr>
                 <w:rFonts w:ascii="Calibri" w:hAnsi="Calibri"/>
-                <w:color w:val="333333"/>
-                <w:sz w:val="20"/>
+                <w:b w:val="0"/>
+                <w:i/>
+                <w:color w:val="666666"/>
+                <w:sz w:val="17"/>
               </w:rPr>
-              <w:t xml:space="preserve"> Teledetección e Imágenes Satelitales</w:t>
+              <w:t>Secretaría de Medio Ambiente, GAMSCZ</w:t>
             </w:r>
           </w:p>
         </w:tc>
@@ -2199,53 +839,61 @@
       <w:tr>
         <w:tc>
           <w:tcPr>
-            <w:tcW w:type="dxa" w:w="4986"/>
+            <w:tcW w:type="dxa" w:w="1701"/>
           </w:tcPr>
           <w:p>
             <w:pPr>
-              <w:spacing w:before="40" w:after="40"/>
+              <w:spacing w:before="60" w:after="20"/>
             </w:pPr>
             <w:r>
               <w:rPr>
                 <w:rFonts w:ascii="Calibri" w:hAnsi="Calibri"/>
+                <w:b/>
+                <w:i w:val="0"/>
                 <w:color w:val="2E86AB"/>
-                <w:sz w:val="14"/>
+                <w:sz w:val="16"/>
               </w:rPr>
-              <w:t xml:space="preserve">▪ </w:t>
-            </w:r>
-            <w:r>
-              <w:rPr>
-                <w:rFonts w:ascii="Calibri" w:hAnsi="Calibri"/>
-                <w:color w:val="333333"/>
-                <w:sz w:val="20"/>
-              </w:rPr>
-              <w:t xml:space="preserve"> Inspección Técnica Ambiental</w:t>
+              <w:t>Dic 2012 – 2013</w:t>
             </w:r>
           </w:p>
         </w:tc>
         <w:tc>
           <w:tcPr>
-            <w:tcW w:type="dxa" w:w="4986"/>
+            <w:tcW w:type="dxa" w:w="2551"/>
           </w:tcPr>
           <w:p>
             <w:pPr>
-              <w:spacing w:before="40" w:after="40"/>
+              <w:spacing w:before="60" w:after="20"/>
             </w:pPr>
             <w:r>
               <w:rPr>
                 <w:rFonts w:ascii="Calibri" w:hAnsi="Calibri"/>
-                <w:color w:val="2E86AB"/>
-                <w:sz w:val="14"/>
+                <w:b/>
+                <w:i w:val="0"/>
+                <w:color w:val="0F2B46"/>
+                <w:sz w:val="18"/>
               </w:rPr>
-              <w:t xml:space="preserve">▪ </w:t>
+              <w:t>Supervisor QHSE</w:t>
             </w:r>
+          </w:p>
+        </w:tc>
+        <w:tc>
+          <w:tcPr>
+            <w:tcW w:type="dxa" w:w="5669"/>
+          </w:tcPr>
+          <w:p>
+            <w:pPr>
+              <w:spacing w:before="60" w:after="20"/>
+            </w:pPr>
             <w:r>
               <w:rPr>
                 <w:rFonts w:ascii="Calibri" w:hAnsi="Calibri"/>
-                <w:color w:val="333333"/>
-                <w:sz w:val="20"/>
+                <w:b w:val="0"/>
+                <w:i/>
+                <w:color w:val="666666"/>
+                <w:sz w:val="17"/>
               </w:rPr>
-              <w:t xml:space="preserve"> Gestión de Residuos Sólidos y Peligrosos</w:t>
+              <w:t>EMALINPER CATERING – Campamentos Río Grande-85 (YPFB Andina), Margarita X-5/X-6 (Repsol YPF)</w:t>
             </w:r>
           </w:p>
         </w:tc>
@@ -2253,53 +901,61 @@
       <w:tr>
         <w:tc>
           <w:tcPr>
-            <w:tcW w:type="dxa" w:w="4986"/>
+            <w:tcW w:type="dxa" w:w="1701"/>
           </w:tcPr>
           <w:p>
             <w:pPr>
-              <w:spacing w:before="40" w:after="40"/>
+              <w:spacing w:before="60" w:after="20"/>
             </w:pPr>
             <w:r>
               <w:rPr>
                 <w:rFonts w:ascii="Calibri" w:hAnsi="Calibri"/>
+                <w:b/>
+                <w:i w:val="0"/>
                 <w:color w:val="2E86AB"/>
-                <w:sz w:val="14"/>
+                <w:sz w:val="16"/>
               </w:rPr>
-              <w:t xml:space="preserve">▪ </w:t>
-            </w:r>
-            <w:r>
-              <w:rPr>
-                <w:rFonts w:ascii="Calibri" w:hAnsi="Calibri"/>
-                <w:color w:val="333333"/>
-                <w:sz w:val="20"/>
-              </w:rPr>
-              <w:t xml:space="preserve"> Gestión de Riesgos y Cumplimiento Normativo</w:t>
+              <w:t>Nov 2012</w:t>
             </w:r>
           </w:p>
         </w:tc>
         <w:tc>
           <w:tcPr>
-            <w:tcW w:type="dxa" w:w="4986"/>
+            <w:tcW w:type="dxa" w:w="2551"/>
           </w:tcPr>
           <w:p>
             <w:pPr>
-              <w:spacing w:before="40" w:after="40"/>
+              <w:spacing w:before="60" w:after="20"/>
             </w:pPr>
             <w:r>
               <w:rPr>
                 <w:rFonts w:ascii="Calibri" w:hAnsi="Calibri"/>
-                <w:color w:val="2E86AB"/>
-                <w:sz w:val="14"/>
+                <w:b/>
+                <w:i w:val="0"/>
+                <w:color w:val="0F2B46"/>
+                <w:sz w:val="18"/>
               </w:rPr>
-              <w:t xml:space="preserve">▪ </w:t>
+              <w:t>Técnico en Monitoreo Ambiental</w:t>
             </w:r>
+          </w:p>
+        </w:tc>
+        <w:tc>
+          <w:tcPr>
+            <w:tcW w:type="dxa" w:w="5669"/>
+          </w:tcPr>
+          <w:p>
+            <w:pPr>
+              <w:spacing w:before="60" w:after="20"/>
+            </w:pPr>
             <w:r>
               <w:rPr>
                 <w:rFonts w:ascii="Calibri" w:hAnsi="Calibri"/>
-                <w:color w:val="333333"/>
-                <w:sz w:val="20"/>
+                <w:b w:val="0"/>
+                <w:i/>
+                <w:color w:val="666666"/>
+                <w:sz w:val="17"/>
               </w:rPr>
-              <w:t xml:space="preserve"> Sistemas de Gestión OHSAS 18001</w:t>
+              <w:t>Consultora GUAYABOCHI S.R.L. – Monitoreo a radio bases Telecel S.A.</w:t>
             </w:r>
           </w:p>
         </w:tc>
@@ -2307,53 +963,150 @@
       <w:tr>
         <w:tc>
           <w:tcPr>
-            <w:tcW w:type="dxa" w:w="4986"/>
+            <w:tcW w:type="dxa" w:w="1701"/>
           </w:tcPr>
           <w:p>
             <w:pPr>
-              <w:spacing w:before="40" w:after="40"/>
+              <w:spacing w:before="60" w:after="20"/>
             </w:pPr>
             <w:r>
               <w:rPr>
                 <w:rFonts w:ascii="Calibri" w:hAnsi="Calibri"/>
+                <w:b/>
+                <w:i w:val="0"/>
                 <w:color w:val="2E86AB"/>
-                <w:sz w:val="14"/>
+                <w:sz w:val="16"/>
+              </w:rPr>
+              <w:t>Jul – Ago 2012</w:t>
+            </w:r>
+          </w:p>
+        </w:tc>
+        <w:tc>
+          <w:tcPr>
+            <w:tcW w:type="dxa" w:w="2551"/>
+          </w:tcPr>
+          <w:p>
+            <w:pPr>
+              <w:spacing w:before="60" w:after="20"/>
+            </w:pPr>
+            <w:r>
+              <w:rPr>
+                <w:rFonts w:ascii="Calibri" w:hAnsi="Calibri"/>
+                <w:b/>
+                <w:i w:val="0"/>
+                <w:color w:val="0F2B46"/>
+                <w:sz w:val="18"/>
+              </w:rPr>
+              <w:t>Prácticas Profesionales</w:t>
+            </w:r>
+          </w:p>
+        </w:tc>
+        <w:tc>
+          <w:tcPr>
+            <w:tcW w:type="dxa" w:w="5669"/>
+          </w:tcPr>
+          <w:p>
+            <w:pPr>
+              <w:spacing w:before="60" w:after="20"/>
+            </w:pPr>
+            <w:r>
+              <w:rPr>
+                <w:rFonts w:ascii="Calibri" w:hAnsi="Calibri"/>
+                <w:b w:val="0"/>
+                <w:i/>
+                <w:color w:val="666666"/>
+                <w:sz w:val="17"/>
+              </w:rPr>
+              <w:t>ABT – Análisis de deforestación nacional mediante imágenes satelitales</w:t>
+            </w:r>
+          </w:p>
+        </w:tc>
+      </w:tr>
+    </w:tbl>
+    <w:p>
+      <w:pPr>
+        <w:spacing w:before="200" w:after="0"/>
+        <w:pBdr>
+          <w:bottom w:val="single" w:sz="6" w:space="1" w:color="1B3A5C"/>
+        </w:pBdr>
+      </w:pPr>
+      <w:r>
+        <w:rPr>
+          <w:rFonts w:ascii="Calibri" w:hAnsi="Calibri"/>
+          <w:b/>
+          <w:color w:val="1B3A5C"/>
+          <w:sz w:val="21"/>
+          <w:spacing w:val="50"/>
+        </w:rPr>
+        <w:t>FORMACIÓN ACADÉMICA</w:t>
+      </w:r>
+    </w:p>
+    <w:tbl>
+      <w:tblPr>
+        <w:tblW w:type="auto" w:w="0"/>
+        <w:tblLook w:firstColumn="1" w:firstRow="1" w:lastColumn="0" w:lastRow="0" w:noHBand="0" w:noVBand="1" w:val="04A0"/>
+        <w:tblW w:type="pct" w:w="5000"/>
+        <w:tblBorders>
+          <w:top w:val="none" w:sz="0" w:space="0" w:color="auto"/>
+          <w:left w:val="none" w:sz="0" w:space="0" w:color="auto"/>
+          <w:bottom w:val="none" w:sz="0" w:space="0" w:color="auto"/>
+          <w:right w:val="none" w:sz="0" w:space="0" w:color="auto"/>
+          <w:insideH w:val="none" w:sz="0" w:space="0" w:color="auto"/>
+          <w:insideV w:val="none" w:sz="0" w:space="0" w:color="auto"/>
+        </w:tblBorders>
+      </w:tblPr>
+      <w:tblGrid>
+        <w:gridCol w:w="5100"/>
+        <w:gridCol w:w="5100"/>
+      </w:tblGrid>
+      <w:tr>
+        <w:tc>
+          <w:tcPr>
+            <w:tcW w:type="dxa" w:w="5953"/>
+          </w:tcPr>
+          <w:p>
+            <w:pPr>
+              <w:spacing w:before="60" w:after="20"/>
+            </w:pPr>
+            <w:r>
+              <w:rPr>
+                <w:rFonts w:ascii="Calibri" w:hAnsi="Calibri"/>
+                <w:b w:val="0"/>
+                <w:i w:val="0"/>
+                <w:color w:val="2E86AB"/>
+                <w:sz w:val="12"/>
               </w:rPr>
               <w:t xml:space="preserve">▪ </w:t>
             </w:r>
             <w:r>
               <w:rPr>
                 <w:rFonts w:ascii="Calibri" w:hAnsi="Calibri"/>
-                <w:color w:val="333333"/>
-                <w:sz w:val="20"/>
+                <w:b/>
+                <w:i w:val="0"/>
+                <w:color w:val="0F2B46"/>
+                <w:sz w:val="19"/>
               </w:rPr>
-              <w:t xml:space="preserve"> Supervisión QHSE</w:t>
+              <w:t>Diplomado en Diseño de Plantas de Tratamiento de Residuos</w:t>
             </w:r>
           </w:p>
         </w:tc>
         <w:tc>
           <w:tcPr>
-            <w:tcW w:type="dxa" w:w="4986"/>
+            <w:tcW w:type="dxa" w:w="3969"/>
           </w:tcPr>
           <w:p>
             <w:pPr>
-              <w:spacing w:before="40" w:after="40"/>
+              <w:spacing w:before="60" w:after="20"/>
             </w:pPr>
             <w:r>
               <w:rPr>
                 <w:rFonts w:ascii="Calibri" w:hAnsi="Calibri"/>
-                <w:color w:val="2E86AB"/>
-                <w:sz w:val="14"/>
+                <w:b w:val="0"/>
+                <w:i/>
+                <w:color w:val="666666"/>
+                <w:sz w:val="17"/>
               </w:rPr>
-              <w:t xml:space="preserve">▪ </w:t>
-            </w:r>
-            <w:r>
-              <w:rPr>
-                <w:rFonts w:ascii="Calibri" w:hAnsi="Calibri"/>
-                <w:color w:val="333333"/>
-                <w:sz w:val="20"/>
-              </w:rPr>
-              <w:t xml:space="preserve"> Elaboración de Fichas Ambientales (RPCA)</w:t>
+              <w:t>Postgrado – UAGRM, Facultad de Tecnología</w:t>
             </w:r>
           </w:p>
         </w:tc>
@@ -2361,53 +1114,103 @@
       <w:tr>
         <w:tc>
           <w:tcPr>
-            <w:tcW w:type="dxa" w:w="4986"/>
+            <w:tcW w:type="dxa" w:w="5953"/>
           </w:tcPr>
           <w:p>
             <w:pPr>
-              <w:spacing w:before="40" w:after="40"/>
+              <w:spacing w:before="60" w:after="20"/>
             </w:pPr>
             <w:r>
               <w:rPr>
                 <w:rFonts w:ascii="Calibri" w:hAnsi="Calibri"/>
+                <w:b w:val="0"/>
+                <w:i w:val="0"/>
                 <w:color w:val="2E86AB"/>
-                <w:sz w:val="14"/>
+                <w:sz w:val="12"/>
               </w:rPr>
               <w:t xml:space="preserve">▪ </w:t>
             </w:r>
             <w:r>
               <w:rPr>
                 <w:rFonts w:ascii="Calibri" w:hAnsi="Calibri"/>
-                <w:color w:val="333333"/>
-                <w:sz w:val="20"/>
+                <w:b/>
+                <w:i w:val="0"/>
+                <w:color w:val="0F2B46"/>
+                <w:sz w:val="19"/>
               </w:rPr>
-              <w:t xml:space="preserve"> Liderazgo de Equipos Multidisciplinarios</w:t>
+              <w:t>Ingeniería Ambiental  –  Titulado, 2012</w:t>
             </w:r>
           </w:p>
         </w:tc>
         <w:tc>
           <w:tcPr>
-            <w:tcW w:type="dxa" w:w="4986"/>
+            <w:tcW w:type="dxa" w:w="3969"/>
           </w:tcPr>
           <w:p>
             <w:pPr>
-              <w:spacing w:before="40" w:after="40"/>
+              <w:spacing w:before="60" w:after="20"/>
             </w:pPr>
             <w:r>
               <w:rPr>
                 <w:rFonts w:ascii="Calibri" w:hAnsi="Calibri"/>
+                <w:b w:val="0"/>
+                <w:i/>
+                <w:color w:val="666666"/>
+                <w:sz w:val="17"/>
+              </w:rPr>
+              <w:t>Universidad Autónoma Gabriel René Moreno</w:t>
+            </w:r>
+          </w:p>
+        </w:tc>
+      </w:tr>
+      <w:tr>
+        <w:tc>
+          <w:tcPr>
+            <w:tcW w:type="dxa" w:w="5953"/>
+          </w:tcPr>
+          <w:p>
+            <w:pPr>
+              <w:spacing w:before="60" w:after="20"/>
+            </w:pPr>
+            <w:r>
+              <w:rPr>
+                <w:rFonts w:ascii="Calibri" w:hAnsi="Calibri"/>
+                <w:b w:val="0"/>
+                <w:i w:val="0"/>
                 <w:color w:val="2E86AB"/>
-                <w:sz w:val="14"/>
+                <w:sz w:val="12"/>
               </w:rPr>
               <w:t xml:space="preserve">▪ </w:t>
             </w:r>
             <w:r>
               <w:rPr>
                 <w:rFonts w:ascii="Calibri" w:hAnsi="Calibri"/>
-                <w:color w:val="333333"/>
-                <w:sz w:val="20"/>
+                <w:b/>
+                <w:i w:val="0"/>
+                <w:color w:val="0F2B46"/>
+                <w:sz w:val="19"/>
               </w:rPr>
-              <w:t xml:space="preserve"> Normativa Ambiental Boliviana (Ley 1333)</w:t>
+              <w:t>Bachiller en Humanidades  –  2005</w:t>
+            </w:r>
+          </w:p>
+        </w:tc>
+        <w:tc>
+          <w:tcPr>
+            <w:tcW w:type="dxa" w:w="3969"/>
+          </w:tcPr>
+          <w:p>
+            <w:pPr>
+              <w:spacing w:before="60" w:after="20"/>
+            </w:pPr>
+            <w:r>
+              <w:rPr>
+                <w:rFonts w:ascii="Calibri" w:hAnsi="Calibri"/>
+                <w:b w:val="0"/>
+                <w:i/>
+                <w:color w:val="666666"/>
+                <w:sz w:val="17"/>
+              </w:rPr>
+              <w:t>Colegio Evangélico Río Nuevo, Santa Cruz</w:t>
             </w:r>
           </w:p>
         </w:tc>
@@ -2415,127 +1218,976 @@
     </w:tbl>
     <w:p>
       <w:pPr>
-        <w:spacing w:before="280" w:after="40"/>
+        <w:spacing w:before="200" w:after="0"/>
+        <w:pBdr>
+          <w:bottom w:val="single" w:sz="6" w:space="1" w:color="1B3A5C"/>
+        </w:pBdr>
       </w:pPr>
       <w:r>
         <w:rPr>
           <w:rFonts w:ascii="Calibri" w:hAnsi="Calibri"/>
           <w:b/>
           <w:color w:val="1B3A5C"/>
-          <w:sz w:val="24"/>
-          <w:spacing w:val="40"/>
+          <w:sz w:val="21"/>
+          <w:spacing w:val="50"/>
         </w:rPr>
-        <w:t>INFORMACIÓN ADICIONAL</w:t>
+        <w:t>CERTIFICACIONES Y FORMACIÓN COMPLEMENTARIA</w:t>
       </w:r>
     </w:p>
+    <w:tbl>
+      <w:tblPr>
+        <w:tblW w:type="auto" w:w="0"/>
+        <w:tblLook w:firstColumn="1" w:firstRow="1" w:lastColumn="0" w:lastRow="0" w:noHBand="0" w:noVBand="1" w:val="04A0"/>
+        <w:tblW w:type="pct" w:w="5000"/>
+        <w:tblBorders>
+          <w:top w:val="none" w:sz="0" w:space="0" w:color="auto"/>
+          <w:left w:val="none" w:sz="0" w:space="0" w:color="auto"/>
+          <w:bottom w:val="none" w:sz="0" w:space="0" w:color="auto"/>
+          <w:right w:val="none" w:sz="0" w:space="0" w:color="auto"/>
+          <w:insideH w:val="none" w:sz="0" w:space="0" w:color="auto"/>
+          <w:insideV w:val="none" w:sz="0" w:space="0" w:color="auto"/>
+        </w:tblBorders>
+      </w:tblPr>
+      <w:tblGrid>
+        <w:gridCol w:w="5100"/>
+        <w:gridCol w:w="5100"/>
+      </w:tblGrid>
+      <w:tr>
+        <w:tc>
+          <w:tcPr>
+            <w:tcW w:type="dxa" w:w="5100"/>
+          </w:tcPr>
+          <w:p>
+            <w:pPr>
+              <w:spacing w:before="60" w:after="20"/>
+              <w:ind w:left="144"/>
+            </w:pPr>
+            <w:r>
+              <w:rPr>
+                <w:rFonts w:ascii="Calibri" w:hAnsi="Calibri"/>
+                <w:b w:val="0"/>
+                <w:i w:val="0"/>
+                <w:color w:val="2E86AB"/>
+                <w:sz w:val="12"/>
+              </w:rPr>
+              <w:t xml:space="preserve">▪ </w:t>
+            </w:r>
+            <w:r>
+              <w:rPr>
+                <w:rFonts w:ascii="Calibri" w:hAnsi="Calibri"/>
+                <w:b/>
+                <w:i w:val="0"/>
+                <w:color w:val="0F2B46"/>
+                <w:sz w:val="17"/>
+              </w:rPr>
+              <w:t>Especialista en Sistemas de Gestión OHSAS 18001</w:t>
+            </w:r>
+          </w:p>
+          <w:p>
+            <w:pPr>
+              <w:spacing w:before="0" w:after="0"/>
+              <w:ind w:left="288"/>
+            </w:pPr>
+            <w:r>
+              <w:rPr>
+                <w:rFonts w:ascii="Calibri" w:hAnsi="Calibri"/>
+                <w:b w:val="0"/>
+                <w:i/>
+                <w:color w:val="666666"/>
+                <w:sz w:val="15"/>
+              </w:rPr>
+              <w:t>IBNORCA, 2012</w:t>
+            </w:r>
+          </w:p>
+        </w:tc>
+        <w:tc>
+          <w:tcPr>
+            <w:tcW w:type="dxa" w:w="5100"/>
+          </w:tcPr>
+          <w:p>
+            <w:pPr>
+              <w:spacing w:before="60" w:after="20"/>
+              <w:ind w:left="144"/>
+            </w:pPr>
+            <w:r>
+              <w:rPr>
+                <w:rFonts w:ascii="Calibri" w:hAnsi="Calibri"/>
+                <w:b w:val="0"/>
+                <w:i w:val="0"/>
+                <w:color w:val="2E86AB"/>
+                <w:sz w:val="12"/>
+              </w:rPr>
+              <w:t xml:space="preserve">▪ </w:t>
+            </w:r>
+            <w:r>
+              <w:rPr>
+                <w:rFonts w:ascii="Calibri" w:hAnsi="Calibri"/>
+                <w:b/>
+                <w:i w:val="0"/>
+                <w:color w:val="0F2B46"/>
+                <w:sz w:val="17"/>
+              </w:rPr>
+              <w:t>Seguridad Industrial, Medio Ambiente y Salud</w:t>
+            </w:r>
+          </w:p>
+          <w:p>
+            <w:pPr>
+              <w:spacing w:before="0" w:after="0"/>
+              <w:ind w:left="288"/>
+            </w:pPr>
+            <w:r>
+              <w:rPr>
+                <w:rFonts w:ascii="Calibri" w:hAnsi="Calibri"/>
+                <w:b w:val="0"/>
+                <w:i/>
+                <w:color w:val="666666"/>
+                <w:sz w:val="15"/>
+              </w:rPr>
+              <w:t>INEGAS / PETROBRAS, 2012</w:t>
+            </w:r>
+          </w:p>
+        </w:tc>
+      </w:tr>
+      <w:tr>
+        <w:tc>
+          <w:tcPr>
+            <w:tcW w:type="dxa" w:w="5100"/>
+          </w:tcPr>
+          <w:p>
+            <w:pPr>
+              <w:spacing w:before="60" w:after="20"/>
+              <w:ind w:left="144"/>
+            </w:pPr>
+            <w:r>
+              <w:rPr>
+                <w:rFonts w:ascii="Calibri" w:hAnsi="Calibri"/>
+                <w:b w:val="0"/>
+                <w:i w:val="0"/>
+                <w:color w:val="2E86AB"/>
+                <w:sz w:val="12"/>
+              </w:rPr>
+              <w:t xml:space="preserve">▪ </w:t>
+            </w:r>
+            <w:r>
+              <w:rPr>
+                <w:rFonts w:ascii="Calibri" w:hAnsi="Calibri"/>
+                <w:b/>
+                <w:i w:val="0"/>
+                <w:color w:val="0F2B46"/>
+                <w:sz w:val="17"/>
+              </w:rPr>
+              <w:t>Técnicas de Optimización de Sistemas de Gestión</w:t>
+            </w:r>
+          </w:p>
+          <w:p>
+            <w:pPr>
+              <w:spacing w:before="0" w:after="0"/>
+              <w:ind w:left="288"/>
+            </w:pPr>
+            <w:r>
+              <w:rPr>
+                <w:rFonts w:ascii="Calibri" w:hAnsi="Calibri"/>
+                <w:b w:val="0"/>
+                <w:i/>
+                <w:color w:val="666666"/>
+                <w:sz w:val="15"/>
+              </w:rPr>
+              <w:t>IBNORCA, 2012</w:t>
+            </w:r>
+          </w:p>
+        </w:tc>
+        <w:tc>
+          <w:tcPr>
+            <w:tcW w:type="dxa" w:w="5100"/>
+          </w:tcPr>
+          <w:p>
+            <w:pPr>
+              <w:spacing w:before="60" w:after="20"/>
+              <w:ind w:left="144"/>
+            </w:pPr>
+            <w:r>
+              <w:rPr>
+                <w:rFonts w:ascii="Calibri" w:hAnsi="Calibri"/>
+                <w:b w:val="0"/>
+                <w:i w:val="0"/>
+                <w:color w:val="2E86AB"/>
+                <w:sz w:val="12"/>
+              </w:rPr>
+              <w:t xml:space="preserve">▪ </w:t>
+            </w:r>
+            <w:r>
+              <w:rPr>
+                <w:rFonts w:ascii="Calibri" w:hAnsi="Calibri"/>
+                <w:b/>
+                <w:i w:val="0"/>
+                <w:color w:val="0F2B46"/>
+                <w:sz w:val="17"/>
+              </w:rPr>
+              <w:t>Elaboración y Evaluación de Fichas Ambientales</w:t>
+            </w:r>
+          </w:p>
+          <w:p>
+            <w:pPr>
+              <w:spacing w:before="0" w:after="0"/>
+              <w:ind w:left="288"/>
+            </w:pPr>
+            <w:r>
+              <w:rPr>
+                <w:rFonts w:ascii="Calibri" w:hAnsi="Calibri"/>
+                <w:b w:val="0"/>
+                <w:i/>
+                <w:color w:val="666666"/>
+                <w:sz w:val="15"/>
+              </w:rPr>
+              <w:t>UAGRM, 2012</w:t>
+            </w:r>
+          </w:p>
+        </w:tc>
+      </w:tr>
+      <w:tr>
+        <w:tc>
+          <w:tcPr>
+            <w:tcW w:type="dxa" w:w="5100"/>
+          </w:tcPr>
+          <w:p>
+            <w:pPr>
+              <w:spacing w:before="60" w:after="20"/>
+              <w:ind w:left="144"/>
+            </w:pPr>
+            <w:r>
+              <w:rPr>
+                <w:rFonts w:ascii="Calibri" w:hAnsi="Calibri"/>
+                <w:b w:val="0"/>
+                <w:i w:val="0"/>
+                <w:color w:val="2E86AB"/>
+                <w:sz w:val="12"/>
+              </w:rPr>
+              <w:t xml:space="preserve">▪ </w:t>
+            </w:r>
+            <w:r>
+              <w:rPr>
+                <w:rFonts w:ascii="Calibri" w:hAnsi="Calibri"/>
+                <w:b/>
+                <w:i w:val="0"/>
+                <w:color w:val="0F2B46"/>
+                <w:sz w:val="17"/>
+              </w:rPr>
+              <w:t>Ley 1333, Reglamentos Ambientales y RPCA</w:t>
+            </w:r>
+          </w:p>
+          <w:p>
+            <w:pPr>
+              <w:spacing w:before="0" w:after="0"/>
+              <w:ind w:left="288"/>
+            </w:pPr>
+            <w:r>
+              <w:rPr>
+                <w:rFonts w:ascii="Calibri" w:hAnsi="Calibri"/>
+                <w:b w:val="0"/>
+                <w:i/>
+                <w:color w:val="666666"/>
+                <w:sz w:val="15"/>
+              </w:rPr>
+              <w:t>CAPIA-SRZ / UAGRM, 2009</w:t>
+            </w:r>
+          </w:p>
+        </w:tc>
+        <w:tc>
+          <w:tcPr>
+            <w:tcW w:type="dxa" w:w="5100"/>
+          </w:tcPr>
+          <w:p>
+            <w:pPr>
+              <w:spacing w:before="60" w:after="20"/>
+              <w:ind w:left="144"/>
+            </w:pPr>
+            <w:r>
+              <w:rPr>
+                <w:rFonts w:ascii="Calibri" w:hAnsi="Calibri"/>
+                <w:b w:val="0"/>
+                <w:i w:val="0"/>
+                <w:color w:val="2E86AB"/>
+                <w:sz w:val="12"/>
+              </w:rPr>
+              <w:t xml:space="preserve">▪ </w:t>
+            </w:r>
+            <w:r>
+              <w:rPr>
+                <w:rFonts w:ascii="Calibri" w:hAnsi="Calibri"/>
+                <w:b/>
+                <w:i w:val="0"/>
+                <w:color w:val="0F2B46"/>
+                <w:sz w:val="17"/>
+              </w:rPr>
+              <w:t>Teledetección Aplicada a Recursos Naturales</w:t>
+            </w:r>
+          </w:p>
+          <w:p>
+            <w:pPr>
+              <w:spacing w:before="0" w:after="0"/>
+              <w:ind w:left="288"/>
+            </w:pPr>
+            <w:r>
+              <w:rPr>
+                <w:rFonts w:ascii="Calibri" w:hAnsi="Calibri"/>
+                <w:b w:val="0"/>
+                <w:i/>
+                <w:color w:val="666666"/>
+                <w:sz w:val="15"/>
+              </w:rPr>
+              <w:t>UMSA / SELPER Bolivia, 2008</w:t>
+            </w:r>
+          </w:p>
+        </w:tc>
+      </w:tr>
+      <w:tr>
+        <w:tc>
+          <w:tcPr>
+            <w:tcW w:type="dxa" w:w="5100"/>
+          </w:tcPr>
+          <w:p>
+            <w:pPr>
+              <w:spacing w:before="60" w:after="20"/>
+              <w:ind w:left="144"/>
+            </w:pPr>
+            <w:r>
+              <w:rPr>
+                <w:rFonts w:ascii="Calibri" w:hAnsi="Calibri"/>
+                <w:b w:val="0"/>
+                <w:i w:val="0"/>
+                <w:color w:val="2E86AB"/>
+                <w:sz w:val="12"/>
+              </w:rPr>
+              <w:t xml:space="preserve">▪ </w:t>
+            </w:r>
+            <w:r>
+              <w:rPr>
+                <w:rFonts w:ascii="Calibri" w:hAnsi="Calibri"/>
+                <w:b/>
+                <w:i w:val="0"/>
+                <w:color w:val="0F2B46"/>
+                <w:sz w:val="17"/>
+              </w:rPr>
+              <w:t>Procesamiento Digital de Imágenes Satelitales</w:t>
+            </w:r>
+          </w:p>
+          <w:p>
+            <w:pPr>
+              <w:spacing w:before="0" w:after="0"/>
+              <w:ind w:left="288"/>
+            </w:pPr>
+            <w:r>
+              <w:rPr>
+                <w:rFonts w:ascii="Calibri" w:hAnsi="Calibri"/>
+                <w:b w:val="0"/>
+                <w:i/>
+                <w:color w:val="666666"/>
+                <w:sz w:val="15"/>
+              </w:rPr>
+              <w:t>UMSS, 2008</w:t>
+            </w:r>
+          </w:p>
+        </w:tc>
+        <w:tc>
+          <w:tcPr>
+            <w:tcW w:type="dxa" w:w="5100"/>
+          </w:tcPr>
+          <w:p>
+            <w:pPr>
+              <w:spacing w:before="60" w:after="20"/>
+              <w:ind w:left="144"/>
+            </w:pPr>
+            <w:r>
+              <w:rPr>
+                <w:rFonts w:ascii="Calibri" w:hAnsi="Calibri"/>
+                <w:b w:val="0"/>
+                <w:i w:val="0"/>
+                <w:color w:val="2E86AB"/>
+                <w:sz w:val="12"/>
+              </w:rPr>
+              <w:t xml:space="preserve">▪ </w:t>
+            </w:r>
+            <w:r>
+              <w:rPr>
+                <w:rFonts w:ascii="Calibri" w:hAnsi="Calibri"/>
+                <w:b/>
+                <w:i w:val="0"/>
+                <w:color w:val="0F2B46"/>
+                <w:sz w:val="17"/>
+              </w:rPr>
+              <w:t>Diseño de Vertederos / Control de Derrames</w:t>
+            </w:r>
+          </w:p>
+          <w:p>
+            <w:pPr>
+              <w:spacing w:before="0" w:after="0"/>
+              <w:ind w:left="288"/>
+            </w:pPr>
+            <w:r>
+              <w:rPr>
+                <w:rFonts w:ascii="Calibri" w:hAnsi="Calibri"/>
+                <w:b w:val="0"/>
+                <w:i/>
+                <w:color w:val="666666"/>
+                <w:sz w:val="15"/>
+              </w:rPr>
+              <w:t>UAGRM, 2010</w:t>
+            </w:r>
+          </w:p>
+        </w:tc>
+      </w:tr>
+    </w:tbl>
     <w:p>
       <w:pPr>
-        <w:spacing w:before="40" w:after="120"/>
+        <w:spacing w:before="200" w:after="0"/>
         <w:pBdr>
-          <w:bottom w:val="single" w:sz="4" w:space="1" w:color="1B3A5C"/>
+          <w:bottom w:val="single" w:sz="6" w:space="1" w:color="1B3A5C"/>
         </w:pBdr>
-      </w:pPr>
-    </w:p>
-    <w:p>
-      <w:pPr>
-        <w:spacing w:before="60" w:after="20"/>
-        <w:ind w:left="288"/>
-      </w:pPr>
-      <w:r>
-        <w:rPr>
-          <w:color w:val="2E86AB"/>
-          <w:sz w:val="14"/>
-        </w:rPr>
-        <w:t xml:space="preserve">▪  </w:t>
-      </w:r>
-      <w:r>
-        <w:rPr>
-          <w:rFonts w:ascii="Calibri" w:hAnsi="Calibri"/>
-          <w:b/>
-          <w:color w:val="0F2B46"/>
-          <w:sz w:val="20"/>
-        </w:rPr>
-        <w:t xml:space="preserve">Licencia de Conducir:  </w:t>
-      </w:r>
-      <w:r>
-        <w:rPr>
-          <w:rFonts w:ascii="Calibri" w:hAnsi="Calibri"/>
-          <w:color w:val="333333"/>
-          <w:sz w:val="20"/>
-        </w:rPr>
-        <w:t>Categoría "P"</w:t>
-      </w:r>
-    </w:p>
-    <w:p>
-      <w:pPr>
-        <w:spacing w:before="60" w:after="20"/>
-        <w:ind w:left="288"/>
-      </w:pPr>
-      <w:r>
-        <w:rPr>
-          <w:color w:val="2E86AB"/>
-          <w:sz w:val="14"/>
-        </w:rPr>
-        <w:t xml:space="preserve">▪  </w:t>
-      </w:r>
-      <w:r>
-        <w:rPr>
-          <w:rFonts w:ascii="Calibri" w:hAnsi="Calibri"/>
-          <w:b/>
-          <w:color w:val="0F2B46"/>
-          <w:sz w:val="20"/>
-        </w:rPr>
-        <w:t xml:space="preserve">Idioma:  </w:t>
-      </w:r>
-      <w:r>
-        <w:rPr>
-          <w:rFonts w:ascii="Calibri" w:hAnsi="Calibri"/>
-          <w:color w:val="333333"/>
-          <w:sz w:val="20"/>
-        </w:rPr>
-        <w:t>Español (nativo)</w:t>
-      </w:r>
-    </w:p>
-    <w:p>
-      <w:pPr>
-        <w:spacing w:before="280" w:after="40"/>
       </w:pPr>
       <w:r>
         <w:rPr>
           <w:rFonts w:ascii="Calibri" w:hAnsi="Calibri"/>
           <w:b/>
           <w:color w:val="1B3A5C"/>
-          <w:sz w:val="24"/>
-          <w:spacing w:val="40"/>
+          <w:sz w:val="21"/>
+          <w:spacing w:val="50"/>
         </w:rPr>
-        <w:t>REFERENCIAS</w:t>
+        <w:t>COMPETENCIAS TÉCNICAS</w:t>
       </w:r>
     </w:p>
+    <w:tbl>
+      <w:tblPr>
+        <w:tblW w:type="auto" w:w="0"/>
+        <w:tblLook w:firstColumn="1" w:firstRow="1" w:lastColumn="0" w:lastRow="0" w:noHBand="0" w:noVBand="1" w:val="04A0"/>
+        <w:tblW w:type="pct" w:w="5000"/>
+        <w:tblBorders>
+          <w:top w:val="none" w:sz="0" w:space="0" w:color="auto"/>
+          <w:left w:val="none" w:sz="0" w:space="0" w:color="auto"/>
+          <w:bottom w:val="none" w:sz="0" w:space="0" w:color="auto"/>
+          <w:right w:val="none" w:sz="0" w:space="0" w:color="auto"/>
+          <w:insideH w:val="none" w:sz="0" w:space="0" w:color="auto"/>
+          <w:insideV w:val="none" w:sz="0" w:space="0" w:color="auto"/>
+        </w:tblBorders>
+      </w:tblPr>
+      <w:tblGrid>
+        <w:gridCol w:w="3400"/>
+        <w:gridCol w:w="3400"/>
+        <w:gridCol w:w="3400"/>
+      </w:tblGrid>
+      <w:tr>
+        <w:tc>
+          <w:tcPr>
+            <w:tcW w:type="dxa" w:w="3400"/>
+          </w:tcPr>
+          <w:p>
+            <w:pPr>
+              <w:spacing w:before="40" w:after="20"/>
+              <w:ind w:left="72"/>
+            </w:pPr>
+            <w:r>
+              <w:rPr>
+                <w:rFonts w:ascii="Calibri" w:hAnsi="Calibri"/>
+                <w:b w:val="0"/>
+                <w:i w:val="0"/>
+                <w:color w:val="2E86AB"/>
+                <w:sz w:val="12"/>
+              </w:rPr>
+              <w:t xml:space="preserve">▪ </w:t>
+            </w:r>
+            <w:r>
+              <w:rPr>
+                <w:rFonts w:ascii="Calibri" w:hAnsi="Calibri"/>
+                <w:b w:val="0"/>
+                <w:i w:val="0"/>
+                <w:color w:val="2D2D2D"/>
+                <w:sz w:val="17"/>
+              </w:rPr>
+              <w:t>Fiscalización y Control Regulatorio</w:t>
+            </w:r>
+          </w:p>
+        </w:tc>
+        <w:tc>
+          <w:tcPr>
+            <w:tcW w:type="dxa" w:w="3400"/>
+          </w:tcPr>
+          <w:p>
+            <w:pPr>
+              <w:spacing w:before="40" w:after="20"/>
+              <w:ind w:left="72"/>
+            </w:pPr>
+            <w:r>
+              <w:rPr>
+                <w:rFonts w:ascii="Calibri" w:hAnsi="Calibri"/>
+                <w:b w:val="0"/>
+                <w:i w:val="0"/>
+                <w:color w:val="2E86AB"/>
+                <w:sz w:val="12"/>
+              </w:rPr>
+              <w:t xml:space="preserve">▪ </w:t>
+            </w:r>
+            <w:r>
+              <w:rPr>
+                <w:rFonts w:ascii="Calibri" w:hAnsi="Calibri"/>
+                <w:b w:val="0"/>
+                <w:i w:val="0"/>
+                <w:color w:val="2D2D2D"/>
+                <w:sz w:val="17"/>
+              </w:rPr>
+              <w:t>Teledetección y SIG</w:t>
+            </w:r>
+          </w:p>
+        </w:tc>
+        <w:tc>
+          <w:tcPr>
+            <w:tcW w:type="dxa" w:w="3400"/>
+          </w:tcPr>
+          <w:p>
+            <w:pPr>
+              <w:spacing w:before="40" w:after="20"/>
+              <w:ind w:left="72"/>
+            </w:pPr>
+            <w:r>
+              <w:rPr>
+                <w:rFonts w:ascii="Calibri" w:hAnsi="Calibri"/>
+                <w:b w:val="0"/>
+                <w:i w:val="0"/>
+                <w:color w:val="2E86AB"/>
+                <w:sz w:val="12"/>
+              </w:rPr>
+              <w:t xml:space="preserve">▪ </w:t>
+            </w:r>
+            <w:r>
+              <w:rPr>
+                <w:rFonts w:ascii="Calibri" w:hAnsi="Calibri"/>
+                <w:b w:val="0"/>
+                <w:i w:val="0"/>
+                <w:color w:val="2D2D2D"/>
+                <w:sz w:val="17"/>
+              </w:rPr>
+              <w:t>Gestión de Riesgos</w:t>
+            </w:r>
+          </w:p>
+        </w:tc>
+      </w:tr>
+      <w:tr>
+        <w:tc>
+          <w:tcPr>
+            <w:tcW w:type="dxa" w:w="3400"/>
+          </w:tcPr>
+          <w:p>
+            <w:pPr>
+              <w:spacing w:before="40" w:after="20"/>
+              <w:ind w:left="72"/>
+            </w:pPr>
+            <w:r>
+              <w:rPr>
+                <w:rFonts w:ascii="Calibri" w:hAnsi="Calibri"/>
+                <w:b w:val="0"/>
+                <w:i w:val="0"/>
+                <w:color w:val="2E86AB"/>
+                <w:sz w:val="12"/>
+              </w:rPr>
+              <w:t xml:space="preserve">▪ </w:t>
+            </w:r>
+            <w:r>
+              <w:rPr>
+                <w:rFonts w:ascii="Calibri" w:hAnsi="Calibri"/>
+                <w:b w:val="0"/>
+                <w:i w:val="0"/>
+                <w:color w:val="2D2D2D"/>
+                <w:sz w:val="17"/>
+              </w:rPr>
+              <w:t>Inspección Técnica Ambiental</w:t>
+            </w:r>
+          </w:p>
+        </w:tc>
+        <w:tc>
+          <w:tcPr>
+            <w:tcW w:type="dxa" w:w="3400"/>
+          </w:tcPr>
+          <w:p>
+            <w:pPr>
+              <w:spacing w:before="40" w:after="20"/>
+              <w:ind w:left="72"/>
+            </w:pPr>
+            <w:r>
+              <w:rPr>
+                <w:rFonts w:ascii="Calibri" w:hAnsi="Calibri"/>
+                <w:b w:val="0"/>
+                <w:i w:val="0"/>
+                <w:color w:val="2E86AB"/>
+                <w:sz w:val="12"/>
+              </w:rPr>
+              <w:t xml:space="preserve">▪ </w:t>
+            </w:r>
+            <w:r>
+              <w:rPr>
+                <w:rFonts w:ascii="Calibri" w:hAnsi="Calibri"/>
+                <w:b w:val="0"/>
+                <w:i w:val="0"/>
+                <w:color w:val="2D2D2D"/>
+                <w:sz w:val="17"/>
+              </w:rPr>
+              <w:t>Sistemas de Gestión OHSAS 18001</w:t>
+            </w:r>
+          </w:p>
+        </w:tc>
+        <w:tc>
+          <w:tcPr>
+            <w:tcW w:type="dxa" w:w="3400"/>
+          </w:tcPr>
+          <w:p>
+            <w:pPr>
+              <w:spacing w:before="40" w:after="20"/>
+              <w:ind w:left="72"/>
+            </w:pPr>
+            <w:r>
+              <w:rPr>
+                <w:rFonts w:ascii="Calibri" w:hAnsi="Calibri"/>
+                <w:b w:val="0"/>
+                <w:i w:val="0"/>
+                <w:color w:val="2E86AB"/>
+                <w:sz w:val="12"/>
+              </w:rPr>
+              <w:t xml:space="preserve">▪ </w:t>
+            </w:r>
+            <w:r>
+              <w:rPr>
+                <w:rFonts w:ascii="Calibri" w:hAnsi="Calibri"/>
+                <w:b w:val="0"/>
+                <w:i w:val="0"/>
+                <w:color w:val="2D2D2D"/>
+                <w:sz w:val="17"/>
+              </w:rPr>
+              <w:t>Supervisión QHSE</w:t>
+            </w:r>
+          </w:p>
+        </w:tc>
+      </w:tr>
+      <w:tr>
+        <w:tc>
+          <w:tcPr>
+            <w:tcW w:type="dxa" w:w="3400"/>
+          </w:tcPr>
+          <w:p>
+            <w:pPr>
+              <w:spacing w:before="40" w:after="20"/>
+              <w:ind w:left="72"/>
+            </w:pPr>
+            <w:r>
+              <w:rPr>
+                <w:rFonts w:ascii="Calibri" w:hAnsi="Calibri"/>
+                <w:b w:val="0"/>
+                <w:i w:val="0"/>
+                <w:color w:val="2E86AB"/>
+                <w:sz w:val="12"/>
+              </w:rPr>
+              <w:t xml:space="preserve">▪ </w:t>
+            </w:r>
+            <w:r>
+              <w:rPr>
+                <w:rFonts w:ascii="Calibri" w:hAnsi="Calibri"/>
+                <w:b w:val="0"/>
+                <w:i w:val="0"/>
+                <w:color w:val="2D2D2D"/>
+                <w:sz w:val="17"/>
+              </w:rPr>
+              <w:t>Normativa Ambiental (Ley 1333)</w:t>
+            </w:r>
+          </w:p>
+        </w:tc>
+        <w:tc>
+          <w:tcPr>
+            <w:tcW w:type="dxa" w:w="3400"/>
+          </w:tcPr>
+          <w:p>
+            <w:pPr>
+              <w:spacing w:before="40" w:after="20"/>
+              <w:ind w:left="72"/>
+            </w:pPr>
+            <w:r>
+              <w:rPr>
+                <w:rFonts w:ascii="Calibri" w:hAnsi="Calibri"/>
+                <w:b w:val="0"/>
+                <w:i w:val="0"/>
+                <w:color w:val="2E86AB"/>
+                <w:sz w:val="12"/>
+              </w:rPr>
+              <w:t xml:space="preserve">▪ </w:t>
+            </w:r>
+            <w:r>
+              <w:rPr>
+                <w:rFonts w:ascii="Calibri" w:hAnsi="Calibri"/>
+                <w:b w:val="0"/>
+                <w:i w:val="0"/>
+                <w:color w:val="2D2D2D"/>
+                <w:sz w:val="17"/>
+              </w:rPr>
+              <w:t>Elaboración de Fichas Ambientales</w:t>
+            </w:r>
+          </w:p>
+        </w:tc>
+        <w:tc>
+          <w:tcPr>
+            <w:tcW w:type="dxa" w:w="3400"/>
+          </w:tcPr>
+          <w:p>
+            <w:pPr>
+              <w:spacing w:before="40" w:after="20"/>
+              <w:ind w:left="72"/>
+            </w:pPr>
+            <w:r>
+              <w:rPr>
+                <w:rFonts w:ascii="Calibri" w:hAnsi="Calibri"/>
+                <w:b w:val="0"/>
+                <w:i w:val="0"/>
+                <w:color w:val="2E86AB"/>
+                <w:sz w:val="12"/>
+              </w:rPr>
+              <w:t xml:space="preserve">▪ </w:t>
+            </w:r>
+            <w:r>
+              <w:rPr>
+                <w:rFonts w:ascii="Calibri" w:hAnsi="Calibri"/>
+                <w:b w:val="0"/>
+                <w:i w:val="0"/>
+                <w:color w:val="2D2D2D"/>
+                <w:sz w:val="17"/>
+              </w:rPr>
+              <w:t>Gestión de Residuos</w:t>
+            </w:r>
+          </w:p>
+        </w:tc>
+      </w:tr>
+      <w:tr>
+        <w:tc>
+          <w:tcPr>
+            <w:tcW w:type="dxa" w:w="3400"/>
+          </w:tcPr>
+          <w:p>
+            <w:pPr>
+              <w:spacing w:before="40" w:after="20"/>
+              <w:ind w:left="72"/>
+            </w:pPr>
+            <w:r>
+              <w:rPr>
+                <w:rFonts w:ascii="Calibri" w:hAnsi="Calibri"/>
+                <w:b w:val="0"/>
+                <w:i w:val="0"/>
+                <w:color w:val="2E86AB"/>
+                <w:sz w:val="12"/>
+              </w:rPr>
+              <w:t xml:space="preserve">▪ </w:t>
+            </w:r>
+            <w:r>
+              <w:rPr>
+                <w:rFonts w:ascii="Calibri" w:hAnsi="Calibri"/>
+                <w:b w:val="0"/>
+                <w:i w:val="0"/>
+                <w:color w:val="2D2D2D"/>
+                <w:sz w:val="17"/>
+              </w:rPr>
+              <w:t>Liderazgo de Equipos</w:t>
+            </w:r>
+          </w:p>
+        </w:tc>
+        <w:tc>
+          <w:tcPr>
+            <w:tcW w:type="dxa" w:w="3400"/>
+          </w:tcPr>
+          <w:p>
+            <w:pPr>
+              <w:spacing w:before="40" w:after="20"/>
+              <w:ind w:left="72"/>
+            </w:pPr>
+            <w:r>
+              <w:rPr>
+                <w:rFonts w:ascii="Calibri" w:hAnsi="Calibri"/>
+                <w:b w:val="0"/>
+                <w:i w:val="0"/>
+                <w:color w:val="2E86AB"/>
+                <w:sz w:val="12"/>
+              </w:rPr>
+              <w:t xml:space="preserve">▪ </w:t>
+            </w:r>
+            <w:r>
+              <w:rPr>
+                <w:rFonts w:ascii="Calibri" w:hAnsi="Calibri"/>
+                <w:b w:val="0"/>
+                <w:i w:val="0"/>
+                <w:color w:val="2D2D2D"/>
+                <w:sz w:val="17"/>
+              </w:rPr>
+              <w:t>Planificación Estratégica</w:t>
+            </w:r>
+          </w:p>
+        </w:tc>
+        <w:tc>
+          <w:tcPr>
+            <w:tcW w:type="dxa" w:w="3400"/>
+          </w:tcPr>
+          <w:p>
+            <w:pPr>
+              <w:spacing w:before="40" w:after="20"/>
+              <w:ind w:left="72"/>
+            </w:pPr>
+            <w:r>
+              <w:rPr>
+                <w:rFonts w:ascii="Calibri" w:hAnsi="Calibri"/>
+                <w:b w:val="0"/>
+                <w:i w:val="0"/>
+                <w:color w:val="2E86AB"/>
+                <w:sz w:val="12"/>
+              </w:rPr>
+              <w:t xml:space="preserve">▪ </w:t>
+            </w:r>
+            <w:r>
+              <w:rPr>
+                <w:rFonts w:ascii="Calibri" w:hAnsi="Calibri"/>
+                <w:b w:val="0"/>
+                <w:i w:val="0"/>
+                <w:color w:val="2D2D2D"/>
+                <w:sz w:val="17"/>
+              </w:rPr>
+              <w:t>Cumplimiento Normativo</w:t>
+            </w:r>
+          </w:p>
+        </w:tc>
+      </w:tr>
+    </w:tbl>
     <w:p>
       <w:pPr>
-        <w:spacing w:before="40" w:after="120"/>
+        <w:spacing w:before="200" w:after="0"/>
         <w:pBdr>
-          <w:bottom w:val="single" w:sz="4" w:space="1" w:color="1B3A5C"/>
+          <w:bottom w:val="single" w:sz="6" w:space="1" w:color="1B3A5C"/>
         </w:pBdr>
-      </w:pPr>
-    </w:p>
-    <w:p>
-      <w:pPr>
-        <w:spacing w:before="80" w:after="160"/>
       </w:pPr>
       <w:r>
         <w:rPr>
           <w:rFonts w:ascii="Calibri" w:hAnsi="Calibri"/>
-          <w:i/>
-          <w:color w:val="666666"/>
-          <w:sz w:val="20"/>
+          <w:b/>
+          <w:color w:val="1B3A5C"/>
+          <w:sz w:val="21"/>
+          <w:spacing w:val="50"/>
         </w:rPr>
-        <w:t>Disponibles a solicitud.</w:t>
+        <w:t>INFORMACIÓN ADICIONAL</w:t>
       </w:r>
     </w:p>
+    <w:tbl>
+      <w:tblPr>
+        <w:tblW w:type="auto" w:w="0"/>
+        <w:tblLook w:firstColumn="1" w:firstRow="1" w:lastColumn="0" w:lastRow="0" w:noHBand="0" w:noVBand="1" w:val="04A0"/>
+        <w:tblW w:type="pct" w:w="5000"/>
+        <w:tblBorders>
+          <w:top w:val="none" w:sz="0" w:space="0" w:color="auto"/>
+          <w:left w:val="none" w:sz="0" w:space="0" w:color="auto"/>
+          <w:bottom w:val="none" w:sz="0" w:space="0" w:color="auto"/>
+          <w:right w:val="none" w:sz="0" w:space="0" w:color="auto"/>
+          <w:insideH w:val="none" w:sz="0" w:space="0" w:color="auto"/>
+          <w:insideV w:val="none" w:sz="0" w:space="0" w:color="auto"/>
+        </w:tblBorders>
+      </w:tblPr>
+      <w:tblGrid>
+        <w:gridCol w:w="5100"/>
+        <w:gridCol w:w="5100"/>
+      </w:tblGrid>
+      <w:tr>
+        <w:tc>
+          <w:tcPr>
+            <w:tcW w:type="dxa" w:w="5100"/>
+          </w:tcPr>
+          <w:p>
+            <w:pPr>
+              <w:spacing w:before="60"/>
+            </w:pPr>
+            <w:r>
+              <w:rPr>
+                <w:rFonts w:ascii="Calibri" w:hAnsi="Calibri"/>
+                <w:b/>
+                <w:i w:val="0"/>
+                <w:color w:val="0F2B46"/>
+                <w:sz w:val="17"/>
+              </w:rPr>
+              <w:t xml:space="preserve">Licencia de Conducir: </w:t>
+            </w:r>
+            <w:r>
+              <w:rPr>
+                <w:rFonts w:ascii="Calibri" w:hAnsi="Calibri"/>
+                <w:b w:val="0"/>
+                <w:i w:val="0"/>
+                <w:color w:val="2D2D2D"/>
+                <w:sz w:val="17"/>
+              </w:rPr>
+              <w:t>Categoría "P"</w:t>
+            </w:r>
+            <w:r>
+              <w:rPr>
+                <w:rFonts w:ascii="Calibri" w:hAnsi="Calibri"/>
+                <w:b w:val="0"/>
+                <w:i w:val="0"/>
+                <w:color w:val="666666"/>
+                <w:sz w:val="17"/>
+              </w:rPr>
+              <w:t xml:space="preserve">    |    </w:t>
+            </w:r>
+            <w:r>
+              <w:rPr>
+                <w:rFonts w:ascii="Calibri" w:hAnsi="Calibri"/>
+                <w:b/>
+                <w:i w:val="0"/>
+                <w:color w:val="0F2B46"/>
+                <w:sz w:val="17"/>
+              </w:rPr>
+              <w:t xml:space="preserve">Idioma: </w:t>
+            </w:r>
+            <w:r>
+              <w:rPr>
+                <w:rFonts w:ascii="Calibri" w:hAnsi="Calibri"/>
+                <w:b w:val="0"/>
+                <w:i w:val="0"/>
+                <w:color w:val="2D2D2D"/>
+                <w:sz w:val="17"/>
+              </w:rPr>
+              <w:t>Español (nativo)</w:t>
+            </w:r>
+          </w:p>
+        </w:tc>
+        <w:tc>
+          <w:tcPr>
+            <w:tcW w:type="dxa" w:w="5100"/>
+          </w:tcPr>
+          <w:p>
+            <w:pPr>
+              <w:spacing w:before="60"/>
+              <w:jc w:val="right"/>
+            </w:pPr>
+            <w:r>
+              <w:rPr>
+                <w:rFonts w:ascii="Calibri" w:hAnsi="Calibri"/>
+                <w:b/>
+                <w:i w:val="0"/>
+                <w:color w:val="0F2B46"/>
+                <w:sz w:val="17"/>
+              </w:rPr>
+              <w:t xml:space="preserve">Referencias: </w:t>
+            </w:r>
+            <w:r>
+              <w:rPr>
+                <w:rFonts w:ascii="Calibri" w:hAnsi="Calibri"/>
+                <w:b w:val="0"/>
+                <w:i/>
+                <w:color w:val="666666"/>
+                <w:sz w:val="17"/>
+              </w:rPr>
+              <w:t>Disponibles a solicitud</w:t>
+            </w:r>
+          </w:p>
+        </w:tc>
+      </w:tr>
+    </w:tbl>
     <w:sectPr>
       <w:pgSz w:w="12240" w:h="15840"/>
-      <w:pgMar w:top="850" w:right="1134" w:bottom="850" w:left="1134" w:header="720" w:footer="720" w:gutter="0"/>
+      <w:pgMar w:top="680" w:right="1020" w:bottom="567" w:left="1020" w:header="720" w:footer="720" w:gutter="0"/>
       <w:cols w:space="720"/>
       <w:docGrid w:linePitch="360"/>
     </w:sectPr>
@@ -2907,12 +2559,12 @@
     <w:qFormat/>
     <w:rsid w:val="00FC693F"/>
     <w:pPr>
-      <w:spacing w:after="40" w:before="0" w:line="276" w:lineRule="auto"/>
+      <w:spacing w:after="0" w:before="0" w:line="264" w:lineRule="auto"/>
     </w:pPr>
     <w:rPr>
       <w:rFonts w:ascii="Calibri" w:hAnsi="Calibri"/>
-      <w:color w:val="333333"/>
-      <w:sz w:val="21"/>
+      <w:color w:val="2D2D2D"/>
+      <w:sz w:val="19"/>
     </w:rPr>
   </w:style>
   <w:style w:type="paragraph" w:styleId="Header">

</xml_diff>